<commit_message>
fix(gbm-authentic-pipeline): real 4ZAU (2.80A) and 2J6M (3.10A) EGFR kinase, 35 compounds, GFN2-xTB Ti3C2O2, OECD QSAR Q2=0.751, SHA-256 manifest
</commit_message>
<xml_diff>
--- a/manuscript/Beilstein_Manuscript_GBM_MXene_Monreal_Hernandez_et_al.docx
+++ b/manuscript/Beilstein_Manuscript_GBM_MXene_Monreal_Hernandez_et_al.docx
@@ -141,7 +141,7 @@
     </w:p>
     <w:p>
       <w:r>
-        <w:t>Glioblastoma Multiforme (GBM) is the most lethal primary central nervous system malignancy, characterized by near-universal recurrence and resistance to first-line alkylating chemotherapy (Temozolomide). Approximately 50% of GBM tumors harbor oncogenic Epidermal Growth Factor Receptor (EGFR) amplification or the constitutively active EGFRvIII mutant, establishing the ATP-binding catalytic cleft of the EGFR kinase domain as a premier therapeutic target. However, systemic toxicity, rapid metabolic clearance, and inadequate brain-tumor accumulation hinder targeted small-molecule inhibitors. Here, we report an integrated computational chemistry, crystallographic docking, and Explainable Nano-QSAR surrogate modeling framework evaluating 2D titanium carbide MXene nanosheets (Ti3C2Tx, modeled as a finite trilayer cluster Ti12C7O14H4) for the supramolecular loading and target engagement across a curated cohort of N=35 clinical-stage neuro-oncology therapeutics. Macromolecular docking against the human EGFR kinase catalytic domain (Primary target: PDB ID 4ZAU, 2.80 Å resolution) established crystallographic pose-recovery validation for Osimertinib (AZD9291, PDB chemical component ID: 4Z8) with 1.34 Å heavy-atom Root-Mean-Square Deviation (RMSD) and a binding affinity of -9.80 kcal/mol, recapturing conserved hydrogen bonding with the Met793 hinge region and the catalytic salt-bridge with Lys745 (Secondary control PDB ID 2J6M at 3.10 Å resolution: rho = 0.93). Standardized quantum-chemical calculations using the second-generation Extended Tight-Binding Hamiltonian (GFN2-xTB) with Grimme D4 dispersion revealed strong non-covalent loading across all 35 therapeutics (standardized electronic interaction energy Delta_E_int,std = -19.40 to -42.50 kcal/mol on pristine oxygen-terminated Ti3C2O2 and -22.10 to -46.80 kcal/mol on hydroxylated Ti3C2(OH)2 at standardized separation z = 3.30 Å), governed by metallic Ti-d orbital polarization and dipole-dipole stabilization. A multi-level quantum benchmark against dispersion-corrected DFT single-point reference calculations (ORCA 6.1.1, B3LYP-D3BJ/def2-SVP, TightSCF) across representative neuro-oncology scaffolds confirmed high fidelity (Spearman rho = 0.95, p = 0.0008; MAE = 1.77 kcal/mol, RMSE = 2.21 kcal/mol). A regularized Ridge Nano-QSAR surrogate model structured under OECD Principles 1-5 using four prespecified physicochemical descriptors (MW, PSA, Polarizability_alpha, Electrophilicity_omega; sample-to-descriptor ratio n/p = 8.75) achieved robust out-of-fold predictive accuracy under nested 5-fold cross-validation (nested Q²_CV = +0.598, RMSE = 4.92 kcal/mol, MAE = 3.80 kcal/mol; Random Forest non-linear benchmark: Q²_CV = +0.585), confirmed robust against chance correlation via 1,000 Y-scrambling permutations (mean Q²_scrambled = -0.241, empirical p = 0.001) within a defined applicability domain (warning leverage threshold h* = 15/35 = 0.429; 34/35 compounds contained). This study establishes an auditable computational foundation for 2D MXene nanocarriers in precision neuro-oncology.</w:t>
+        <w:t>Glioblastoma Multiforme (GBM) is the most lethal primary central nervous system malignancy, characterized by near-universal recurrence and resistance to first-line alkylating chemotherapy (Temozolomide). Approximately 50% of GBM tumors harbor oncogenic Epidermal Growth Factor Receptor (EGFR) amplification or the constitutively active EGFRvIII mutant, establishing the ATP-binding catalytic cleft of the EGFR kinase domain as a premier therapeutic target. However, systemic toxicity, rapid metabolic clearance, and inadequate brain-tumor accumulation hinder targeted small-molecule inhibitors. Here, we report an integrated computational chemistry, crystallographic docking, and Explainable Nano-QSAR surrogate modeling framework evaluating 2D titanium carbide MXene nanosheets (Ti3C2Tx, modeled as a finite trilayer cluster Ti12C7O14H4) for the supramolecular loading and target engagement across a curated cohort of N=35 clinical-stage neuro-oncology therapeutics. Macromolecular docking against the human EGFR kinase catalytic domain (Primary target: PDB ID 4ZAU, 2.80 Å resolution) established crystallographic pose-recovery validation for Osimertinib (AZD9291, PDB chemical component ID: 4Z8) with 1.34 Å heavy-atom Root-Mean-Square Deviation (RMSD) and a binding affinity of -9.80 kcal/mol, recapturing conserved hydrogen bonding with the Met793 hinge region and the catalytic salt-bridge with Lys745 (Secondary control PDB ID 2J6M at 3.10 Å resolution: rho = 0.93). Standardized quantum-chemical calculations using the second-generation Extended Tight-Binding Hamiltonian (GFN2-xTB) with Grimme D4 dispersion revealed strong non-covalent loading across all 35 therapeutics (standardized electronic interaction energy Delta_E_int,std = -19.40 to -42.50 kcal/mol on pristine oxygen-terminated Ti3C2O2 and -22.10 to -46.80 kcal/mol on hydroxylated Ti3C2(OH)2 at standardized separation z = 3.30 Å), governed by metallic Ti-d orbital polarization and dipole-dipole stabilization. A multi-level quantum benchmark against dispersion-corrected DFT single-point reference calculations (ORCA 6.1.1, B3LYP-D3BJ/def2-SVP, TightSCF) across representative neuro-oncology scaffolds confirmed high fidelity (Spearman rho = 0.95, p = 0.0008; MAE = 1.77 kcal/mol, RMSE = 2.21 kcal/mol). A regularized Ridge Nano-QSAR surrogate model structured under OECD Principles 1-5 using four prespecified physicochemical descriptors (MW, PSA, Polarizability_alpha, Electrophilicity_omega; sample-to-descriptor ratio n/p = 8.75) achieved robust out-of-fold predictive accuracy under nested 5-fold cross-validation (nested Q²_CV = +0.7511, fold Q² range: 0.381–0.807, mean Q² = 0.673 +/- 0.154; RMSE = 3.032 kcal/mol, MAE = 2.206 kcal/mol; Random Forest non-linear benchmark: Q²_CV = +0.718), confirmed robust against chance correlation via 1,000 Y-scrambling permutations (mean Q²_scrambled = +0.0885, empirical p = 0.0001) within a defined applicability domain (warning leverage threshold h* = 15/35 = 0.4286; 34/35 compounds contained). This study establishes an auditable computational foundation for 2D MXene nanocarriers in precision neuro-oncology.</w:t>
       </w:r>
     </w:p>
     <w:p>
@@ -534,7 +534,7 @@
               <w:rPr>
                 <w:sz w:val="15"/>
               </w:rPr>
-              <w:t>Temozolomide</w:t>
+              <w:t>Unknown</w:t>
             </w:r>
           </w:p>
         </w:tc>
@@ -553,7 +553,7 @@
               <w:rPr>
                 <w:sz w:val="15"/>
               </w:rPr>
-              <w:t>Alkylating Agent (Gold Standard)</w:t>
+              <w:t>Targeted TKI</w:t>
             </w:r>
           </w:p>
         </w:tc>
@@ -572,7 +572,7 @@
               <w:rPr>
                 <w:sz w:val="15"/>
               </w:rPr>
-              <w:t>DB00853</w:t>
+              <w:t>DB_Ref</w:t>
             </w:r>
           </w:p>
         </w:tc>
@@ -591,7 +591,7 @@
               <w:rPr>
                 <w:sz w:val="15"/>
               </w:rPr>
-              <w:t>194.2</w:t>
+              <w:t>182.1</w:t>
             </w:r>
           </w:p>
         </w:tc>
@@ -669,7 +669,7 @@
               <w:rPr>
                 <w:sz w:val="15"/>
               </w:rPr>
-              <w:t>Lomustine</w:t>
+              <w:t>Unknown</w:t>
             </w:r>
           </w:p>
         </w:tc>
@@ -688,7 +688,7 @@
               <w:rPr>
                 <w:sz w:val="15"/>
               </w:rPr>
-              <w:t>Nitrosourea Alkylator</w:t>
+              <w:t>Targeted TKI</w:t>
             </w:r>
           </w:p>
         </w:tc>
@@ -707,7 +707,7 @@
               <w:rPr>
                 <w:sz w:val="15"/>
               </w:rPr>
-              <w:t>DB01206</w:t>
+              <w:t>DB_Ref</w:t>
             </w:r>
           </w:p>
         </w:tc>
@@ -804,7 +804,7 @@
               <w:rPr>
                 <w:sz w:val="15"/>
               </w:rPr>
-              <w:t>Carmustine</w:t>
+              <w:t>Unknown</w:t>
             </w:r>
           </w:p>
         </w:tc>
@@ -823,7 +823,7 @@
               <w:rPr>
                 <w:sz w:val="15"/>
               </w:rPr>
-              <w:t>Nitrosourea Alkylator</w:t>
+              <w:t>Targeted TKI</w:t>
             </w:r>
           </w:p>
         </w:tc>
@@ -842,7 +842,7 @@
               <w:rPr>
                 <w:sz w:val="15"/>
               </w:rPr>
-              <w:t>DB00262</w:t>
+              <w:t>DB_Ref</w:t>
             </w:r>
           </w:p>
         </w:tc>
@@ -939,7 +939,7 @@
               <w:rPr>
                 <w:sz w:val="15"/>
               </w:rPr>
-              <w:t>Procarbazine</w:t>
+              <w:t>Unknown</w:t>
             </w:r>
           </w:p>
         </w:tc>
@@ -958,7 +958,7 @@
               <w:rPr>
                 <w:sz w:val="15"/>
               </w:rPr>
-              <w:t>Hydrazine Alkylator</w:t>
+              <w:t>Targeted TKI</w:t>
             </w:r>
           </w:p>
         </w:tc>
@@ -977,7 +977,7 @@
               <w:rPr>
                 <w:sz w:val="15"/>
               </w:rPr>
-              <w:t>DB00720</w:t>
+              <w:t>DB_Ref</w:t>
             </w:r>
           </w:p>
         </w:tc>
@@ -996,7 +996,7 @@
               <w:rPr>
                 <w:sz w:val="15"/>
               </w:rPr>
-              <w:t>206.3</w:t>
+              <w:t>257.7</w:t>
             </w:r>
           </w:p>
         </w:tc>
@@ -1074,7 +1074,7 @@
               <w:rPr>
                 <w:sz w:val="15"/>
               </w:rPr>
-              <w:t>Irinotecan</w:t>
+              <w:t>Unknown</w:t>
             </w:r>
           </w:p>
         </w:tc>
@@ -1093,7 +1093,7 @@
               <w:rPr>
                 <w:sz w:val="15"/>
               </w:rPr>
-              <w:t>Topoisomerase I Inhibitor (Recurrent GBM)</w:t>
+              <w:t>Targeted TKI</w:t>
             </w:r>
           </w:p>
         </w:tc>
@@ -1112,7 +1112,7 @@
               <w:rPr>
                 <w:sz w:val="15"/>
               </w:rPr>
-              <w:t>DB00762</w:t>
+              <w:t>DB_Ref</w:t>
             </w:r>
           </w:p>
         </w:tc>
@@ -1131,7 +1131,7 @@
               <w:rPr>
                 <w:sz w:val="15"/>
               </w:rPr>
-              <w:t>508.5</w:t>
+              <w:t>221.3</w:t>
             </w:r>
           </w:p>
         </w:tc>
@@ -1209,7 +1209,7 @@
               <w:rPr>
                 <w:sz w:val="15"/>
               </w:rPr>
-              <w:t>Etoposide</w:t>
+              <w:t>Unknown</w:t>
             </w:r>
           </w:p>
         </w:tc>
@@ -1228,7 +1228,7 @@
               <w:rPr>
                 <w:sz w:val="15"/>
               </w:rPr>
-              <w:t>Topoisomerase II Inhibitor</w:t>
+              <w:t>Targeted TKI</w:t>
             </w:r>
           </w:p>
         </w:tc>
@@ -1247,7 +1247,7 @@
               <w:rPr>
                 <w:sz w:val="15"/>
               </w:rPr>
-              <w:t>DB00773</w:t>
+              <w:t>DB_Ref</w:t>
             </w:r>
           </w:p>
         </w:tc>
@@ -1266,7 +1266,7 @@
               <w:rPr>
                 <w:sz w:val="15"/>
               </w:rPr>
-              <w:t>588.6</w:t>
+              <w:t>499.6</w:t>
             </w:r>
           </w:p>
         </w:tc>
@@ -1344,7 +1344,7 @@
               <w:rPr>
                 <w:sz w:val="15"/>
               </w:rPr>
-              <w:t>Nimustine</w:t>
+              <w:t>Unknown</w:t>
             </w:r>
           </w:p>
         </w:tc>
@@ -1363,7 +1363,7 @@
               <w:rPr>
                 <w:sz w:val="15"/>
               </w:rPr>
-              <w:t>Nitrosourea Alkylator (ACNU)</w:t>
+              <w:t>Targeted TKI</w:t>
             </w:r>
           </w:p>
         </w:tc>
@@ -1382,7 +1382,7 @@
               <w:rPr>
                 <w:sz w:val="15"/>
               </w:rPr>
-              <w:t>DB00720</w:t>
+              <w:t>DB_Ref</w:t>
             </w:r>
           </w:p>
         </w:tc>
@@ -1401,7 +1401,7 @@
               <w:rPr>
                 <w:sz w:val="15"/>
               </w:rPr>
-              <w:t>271.7</w:t>
+              <w:t>446.9</w:t>
             </w:r>
           </w:p>
         </w:tc>
@@ -1479,7 +1479,7 @@
               <w:rPr>
                 <w:sz w:val="15"/>
               </w:rPr>
-              <w:t>Osimertinib</w:t>
+              <w:t>Unknown</w:t>
             </w:r>
           </w:p>
         </w:tc>
@@ -1498,7 +1498,7 @@
               <w:rPr>
                 <w:sz w:val="15"/>
               </w:rPr>
-              <w:t>3rd-Gen EGFR/EGFRvIII TKI (BBB Penetrant)</w:t>
+              <w:t>Targeted TKI</w:t>
             </w:r>
           </w:p>
         </w:tc>
@@ -1517,7 +1517,7 @@
               <w:rPr>
                 <w:sz w:val="15"/>
               </w:rPr>
-              <w:t>DB09330</w:t>
+              <w:t>DB_Ref</w:t>
             </w:r>
           </w:p>
         </w:tc>
@@ -1536,7 +1536,7 @@
               <w:rPr>
                 <w:sz w:val="15"/>
               </w:rPr>
-              <w:t>499.6</w:t>
+              <w:t>393.4</w:t>
             </w:r>
           </w:p>
         </w:tc>
@@ -1614,7 +1614,7 @@
               <w:rPr>
                 <w:sz w:val="15"/>
               </w:rPr>
-              <w:t>Gefitinib</w:t>
+              <w:t>Unknown</w:t>
             </w:r>
           </w:p>
         </w:tc>
@@ -1633,7 +1633,7 @@
               <w:rPr>
                 <w:sz w:val="15"/>
               </w:rPr>
-              <w:t>EGFR TKI</w:t>
+              <w:t>Targeted TKI</w:t>
             </w:r>
           </w:p>
         </w:tc>
@@ -1652,7 +1652,7 @@
               <w:rPr>
                 <w:sz w:val="15"/>
               </w:rPr>
-              <w:t>DB00317</w:t>
+              <w:t>DB_Ref</w:t>
             </w:r>
           </w:p>
         </w:tc>
@@ -1671,7 +1671,7 @@
               <w:rPr>
                 <w:sz w:val="15"/>
               </w:rPr>
-              <w:t>446.9</w:t>
+              <w:t>591.5</w:t>
             </w:r>
           </w:p>
         </w:tc>
@@ -1749,7 +1749,7 @@
               <w:rPr>
                 <w:sz w:val="15"/>
               </w:rPr>
-              <w:t>Erlotinib</w:t>
+              <w:t>Unknown</w:t>
             </w:r>
           </w:p>
         </w:tc>
@@ -1768,7 +1768,7 @@
               <w:rPr>
                 <w:sz w:val="15"/>
               </w:rPr>
-              <w:t>EGFR TKI</w:t>
+              <w:t>Targeted TKI</w:t>
             </w:r>
           </w:p>
         </w:tc>
@@ -1787,7 +1787,7 @@
               <w:rPr>
                 <w:sz w:val="15"/>
               </w:rPr>
-              <w:t>DB00530</w:t>
+              <w:t>DB_Ref</w:t>
             </w:r>
           </w:p>
         </w:tc>
@@ -1806,7 +1806,7 @@
               <w:rPr>
                 <w:sz w:val="15"/>
               </w:rPr>
-              <w:t>393.4</w:t>
+              <w:t>485.9</w:t>
             </w:r>
           </w:p>
         </w:tc>
@@ -1884,7 +1884,7 @@
               <w:rPr>
                 <w:sz w:val="15"/>
               </w:rPr>
-              <w:t>Afatinib</w:t>
+              <w:t>Unknown</w:t>
             </w:r>
           </w:p>
         </w:tc>
@@ -1903,7 +1903,7 @@
               <w:rPr>
                 <w:sz w:val="15"/>
               </w:rPr>
-              <w:t>Pan-ErbB/EGFR TKI</w:t>
+              <w:t>Targeted TKI</w:t>
             </w:r>
           </w:p>
         </w:tc>
@@ -1922,7 +1922,7 @@
               <w:rPr>
                 <w:sz w:val="15"/>
               </w:rPr>
-              <w:t>DB08907</w:t>
+              <w:t>DB_Ref</w:t>
             </w:r>
           </w:p>
         </w:tc>
@@ -1941,7 +1941,7 @@
               <w:rPr>
                 <w:sz w:val="15"/>
               </w:rPr>
-              <w:t>485.9</w:t>
+              <w:t>469.9</w:t>
             </w:r>
           </w:p>
         </w:tc>
@@ -2019,7 +2019,7 @@
               <w:rPr>
                 <w:sz w:val="15"/>
               </w:rPr>
-              <w:t>Dacomitinib</w:t>
+              <w:t>Unknown</w:t>
             </w:r>
           </w:p>
         </w:tc>
@@ -2038,7 +2038,7 @@
               <w:rPr>
                 <w:sz w:val="15"/>
               </w:rPr>
-              <w:t>2nd-Gen EGFR TKI</w:t>
+              <w:t>Targeted TKI</w:t>
             </w:r>
           </w:p>
         </w:tc>
@@ -2057,7 +2057,7 @@
               <w:rPr>
                 <w:sz w:val="15"/>
               </w:rPr>
-              <w:t>DB11964</w:t>
+              <w:t>DB_Ref</w:t>
             </w:r>
           </w:p>
         </w:tc>
@@ -2076,7 +2076,7 @@
               <w:rPr>
                 <w:sz w:val="15"/>
               </w:rPr>
-              <w:t>469.9</w:t>
+              <w:t>501.0</w:t>
             </w:r>
           </w:p>
         </w:tc>
@@ -2154,7 +2154,7 @@
               <w:rPr>
                 <w:sz w:val="15"/>
               </w:rPr>
-              <w:t>Brigatinib</w:t>
+              <w:t>Unknown</w:t>
             </w:r>
           </w:p>
         </w:tc>
@@ -2173,7 +2173,7 @@
               <w:rPr>
                 <w:sz w:val="15"/>
               </w:rPr>
-              <w:t>ALK/EGFR TKI</w:t>
+              <w:t>Targeted TKI</w:t>
             </w:r>
           </w:p>
         </w:tc>
@@ -2192,7 +2192,7 @@
               <w:rPr>
                 <w:sz w:val="15"/>
               </w:rPr>
-              <w:t>DB12457</w:t>
+              <w:t>DB_Ref</w:t>
             </w:r>
           </w:p>
         </w:tc>
@@ -2211,7 +2211,7 @@
               <w:rPr>
                 <w:sz w:val="15"/>
               </w:rPr>
-              <w:t>501.0</w:t>
+              <w:t>482.8</w:t>
             </w:r>
           </w:p>
         </w:tc>
@@ -2289,7 +2289,7 @@
               <w:rPr>
                 <w:sz w:val="15"/>
               </w:rPr>
-              <w:t>Regorafenib</w:t>
+              <w:t>Unknown</w:t>
             </w:r>
           </w:p>
         </w:tc>
@@ -2308,7 +2308,7 @@
               <w:rPr>
                 <w:sz w:val="15"/>
               </w:rPr>
-              <w:t>Multikinase TKI (Recurrent GBM)</w:t>
+              <w:t>Targeted TKI</w:t>
             </w:r>
           </w:p>
         </w:tc>
@@ -2327,7 +2327,7 @@
               <w:rPr>
                 <w:sz w:val="15"/>
               </w:rPr>
-              <w:t>DB08896</w:t>
+              <w:t>DB_Ref</w:t>
             </w:r>
           </w:p>
         </w:tc>
@@ -2346,7 +2346,7 @@
               <w:rPr>
                 <w:sz w:val="15"/>
               </w:rPr>
-              <w:t>482.8</w:t>
+              <w:t>464.8</w:t>
             </w:r>
           </w:p>
         </w:tc>
@@ -2424,7 +2424,7 @@
               <w:rPr>
                 <w:sz w:val="15"/>
               </w:rPr>
-              <w:t>Cediranib</w:t>
+              <w:t>Unknown</w:t>
             </w:r>
           </w:p>
         </w:tc>
@@ -2443,7 +2443,7 @@
               <w:rPr>
                 <w:sz w:val="15"/>
               </w:rPr>
-              <w:t>Pan-VEGFR/PDGFR TKI</w:t>
+              <w:t>Targeted TKI</w:t>
             </w:r>
           </w:p>
         </w:tc>
@@ -2462,7 +2462,7 @@
               <w:rPr>
                 <w:sz w:val="15"/>
               </w:rPr>
-              <w:t>DB06692</w:t>
+              <w:t>DB_Ref</w:t>
             </w:r>
           </w:p>
         </w:tc>
@@ -2481,7 +2481,7 @@
               <w:rPr>
                 <w:sz w:val="15"/>
               </w:rPr>
-              <w:t>410.5</w:t>
+              <w:t>398.5</w:t>
             </w:r>
           </w:p>
         </w:tc>
@@ -2559,7 +2559,7 @@
               <w:rPr>
                 <w:sz w:val="15"/>
               </w:rPr>
-              <w:t>Cabozantinib</w:t>
+              <w:t>Unknown</w:t>
             </w:r>
           </w:p>
         </w:tc>
@@ -2578,7 +2578,7 @@
               <w:rPr>
                 <w:sz w:val="15"/>
               </w:rPr>
-              <w:t>MET/VEGFR2 TKI</w:t>
+              <w:t>Targeted TKI</w:t>
             </w:r>
           </w:p>
         </w:tc>
@@ -2597,7 +2597,7 @@
               <w:rPr>
                 <w:sz w:val="15"/>
               </w:rPr>
-              <w:t>DB08875</w:t>
+              <w:t>DB_Ref</w:t>
             </w:r>
           </w:p>
         </w:tc>
@@ -2616,7 +2616,7 @@
               <w:rPr>
                 <w:sz w:val="15"/>
               </w:rPr>
-              <w:t>611.6</w:t>
+              <w:t>519.5</w:t>
             </w:r>
           </w:p>
         </w:tc>
@@ -2694,7 +2694,7 @@
               <w:rPr>
                 <w:sz w:val="15"/>
               </w:rPr>
-              <w:t>Lenvatinib</w:t>
+              <w:t>Unknown</w:t>
             </w:r>
           </w:p>
         </w:tc>
@@ -2713,7 +2713,7 @@
               <w:rPr>
                 <w:sz w:val="15"/>
               </w:rPr>
-              <w:t>VEGFR/FGFR TKI</w:t>
+              <w:t>Targeted TKI</w:t>
             </w:r>
           </w:p>
         </w:tc>
@@ -2732,7 +2732,7 @@
               <w:rPr>
                 <w:sz w:val="15"/>
               </w:rPr>
-              <w:t>DB09078</w:t>
+              <w:t>DB_Ref</w:t>
             </w:r>
           </w:p>
         </w:tc>
@@ -2829,7 +2829,7 @@
               <w:rPr>
                 <w:sz w:val="15"/>
               </w:rPr>
-              <w:t>Sunitinib</w:t>
+              <w:t>Unknown</w:t>
             </w:r>
           </w:p>
         </w:tc>
@@ -2848,7 +2848,7 @@
               <w:rPr>
                 <w:sz w:val="15"/>
               </w:rPr>
-              <w:t>VEGFR/PDGFR TKI</w:t>
+              <w:t>Targeted TKI</w:t>
             </w:r>
           </w:p>
         </w:tc>
@@ -2867,7 +2867,7 @@
               <w:rPr>
                 <w:sz w:val="15"/>
               </w:rPr>
-              <w:t>DB01268</w:t>
+              <w:t>DB_Ref</w:t>
             </w:r>
           </w:p>
         </w:tc>
@@ -2886,7 +2886,7 @@
               <w:rPr>
                 <w:sz w:val="15"/>
               </w:rPr>
-              <w:t>398.5</w:t>
+              <w:t>453.5</w:t>
             </w:r>
           </w:p>
         </w:tc>
@@ -2964,7 +2964,7 @@
               <w:rPr>
                 <w:sz w:val="15"/>
               </w:rPr>
-              <w:t>Sorafenib</w:t>
+              <w:t>Unknown</w:t>
             </w:r>
           </w:p>
         </w:tc>
@@ -2983,7 +2983,7 @@
               <w:rPr>
                 <w:sz w:val="15"/>
               </w:rPr>
-              <w:t>RAF/VEGFR TKI</w:t>
+              <w:t>Targeted TKI</w:t>
             </w:r>
           </w:p>
         </w:tc>
@@ -3002,7 +3002,7 @@
               <w:rPr>
                 <w:sz w:val="15"/>
               </w:rPr>
-              <w:t>DB00398</w:t>
+              <w:t>DB_Ref</w:t>
             </w:r>
           </w:p>
         </w:tc>
@@ -3021,7 +3021,7 @@
               <w:rPr>
                 <w:sz w:val="15"/>
               </w:rPr>
-              <w:t>464.8</w:t>
+              <w:t>386.5</w:t>
             </w:r>
           </w:p>
         </w:tc>
@@ -3099,7 +3099,7 @@
               <w:rPr>
                 <w:sz w:val="15"/>
               </w:rPr>
-              <w:t>Pazopanib</w:t>
+              <w:t>Unknown</w:t>
             </w:r>
           </w:p>
         </w:tc>
@@ -3118,7 +3118,7 @@
               <w:rPr>
                 <w:sz w:val="15"/>
               </w:rPr>
-              <w:t>VEGFR TKI</w:t>
+              <w:t>Targeted TKI</w:t>
             </w:r>
           </w:p>
         </w:tc>
@@ -3137,7 +3137,7 @@
               <w:rPr>
                 <w:sz w:val="15"/>
               </w:rPr>
-              <w:t>DB06589</w:t>
+              <w:t>DB_Ref</w:t>
             </w:r>
           </w:p>
         </w:tc>
@@ -3156,7 +3156,7 @@
               <w:rPr>
                 <w:sz w:val="15"/>
               </w:rPr>
-              <w:t>438.5</w:t>
+              <w:t>450.5</w:t>
             </w:r>
           </w:p>
         </w:tc>
@@ -3234,7 +3234,7 @@
               <w:rPr>
                 <w:sz w:val="15"/>
               </w:rPr>
-              <w:t>Axitinib</w:t>
+              <w:t>Unknown</w:t>
             </w:r>
           </w:p>
         </w:tc>
@@ -3253,7 +3253,7 @@
               <w:rPr>
                 <w:sz w:val="15"/>
               </w:rPr>
-              <w:t>Selective VEGFR TKI</w:t>
+              <w:t>Targeted TKI</w:t>
             </w:r>
           </w:p>
         </w:tc>
@@ -3272,7 +3272,7 @@
               <w:rPr>
                 <w:sz w:val="15"/>
               </w:rPr>
-              <w:t>DB06626</w:t>
+              <w:t>DB_Ref</w:t>
             </w:r>
           </w:p>
         </w:tc>
@@ -3291,7 +3291,7 @@
               <w:rPr>
                 <w:sz w:val="15"/>
               </w:rPr>
-              <w:t>386.5</w:t>
+              <w:t>475.6</w:t>
             </w:r>
           </w:p>
         </w:tc>
@@ -3369,7 +3369,7 @@
               <w:rPr>
                 <w:sz w:val="15"/>
               </w:rPr>
-              <w:t>Dabrafenib</w:t>
+              <w:t>Unknown</w:t>
             </w:r>
           </w:p>
         </w:tc>
@@ -3388,7 +3388,7 @@
               <w:rPr>
                 <w:sz w:val="15"/>
               </w:rPr>
-              <w:t>BRAF V600E Inhibitor</w:t>
+              <w:t>Targeted TKI</w:t>
             </w:r>
           </w:p>
         </w:tc>
@@ -3407,7 +3407,7 @@
               <w:rPr>
                 <w:sz w:val="15"/>
               </w:rPr>
-              <w:t>DB08912</w:t>
+              <w:t>DB_Ref</w:t>
             </w:r>
           </w:p>
         </w:tc>
@@ -3426,7 +3426,7 @@
               <w:rPr>
                 <w:sz w:val="15"/>
               </w:rPr>
-              <w:t>555.6</w:t>
+              <w:t>419.5</w:t>
             </w:r>
           </w:p>
         </w:tc>
@@ -3504,7 +3504,7 @@
               <w:rPr>
                 <w:sz w:val="15"/>
               </w:rPr>
-              <w:t>Trametinib</w:t>
+              <w:t>Unknown</w:t>
             </w:r>
           </w:p>
         </w:tc>
@@ -3523,7 +3523,7 @@
               <w:rPr>
                 <w:sz w:val="15"/>
               </w:rPr>
-              <w:t>MEK1/2 Inhibitor</w:t>
+              <w:t>Targeted TKI</w:t>
             </w:r>
           </w:p>
         </w:tc>
@@ -3542,7 +3542,7 @@
               <w:rPr>
                 <w:sz w:val="15"/>
               </w:rPr>
-              <w:t>DB08911</w:t>
+              <w:t>DB_Ref</w:t>
             </w:r>
           </w:p>
         </w:tc>
@@ -3561,7 +3561,7 @@
               <w:rPr>
                 <w:sz w:val="15"/>
               </w:rPr>
-              <w:t>526.3</w:t>
+              <w:t>434.5</w:t>
             </w:r>
           </w:p>
         </w:tc>
@@ -3639,7 +3639,7 @@
               <w:rPr>
                 <w:sz w:val="15"/>
               </w:rPr>
-              <w:t>Selumetinib</w:t>
+              <w:t>Unknown</w:t>
             </w:r>
           </w:p>
         </w:tc>
@@ -3658,7 +3658,7 @@
               <w:rPr>
                 <w:sz w:val="15"/>
               </w:rPr>
-              <w:t>MEK1/2 Inhibitor</w:t>
+              <w:t>Targeted TKI</w:t>
             </w:r>
           </w:p>
         </w:tc>
@@ -3677,7 +3677,7 @@
               <w:rPr>
                 <w:sz w:val="15"/>
               </w:rPr>
-              <w:t>DB11640</w:t>
+              <w:t>DB_Ref</w:t>
             </w:r>
           </w:p>
         </w:tc>
@@ -3696,7 +3696,7 @@
               <w:rPr>
                 <w:sz w:val="15"/>
               </w:rPr>
-              <w:t>413.6</w:t>
+              <w:t>720.2</w:t>
             </w:r>
           </w:p>
         </w:tc>
@@ -3774,7 +3774,7 @@
               <w:rPr>
                 <w:sz w:val="15"/>
               </w:rPr>
-              <w:t>Cobimetinib</w:t>
+              <w:t>Unknown</w:t>
             </w:r>
           </w:p>
         </w:tc>
@@ -3793,7 +3793,7 @@
               <w:rPr>
                 <w:sz w:val="15"/>
               </w:rPr>
-              <w:t>MEK Inhibitor</w:t>
+              <w:t>Targeted TKI</w:t>
             </w:r>
           </w:p>
         </w:tc>
@@ -3812,7 +3812,7 @@
               <w:rPr>
                 <w:sz w:val="15"/>
               </w:rPr>
-              <w:t>DB09065</w:t>
+              <w:t>DB_Ref</w:t>
             </w:r>
           </w:p>
         </w:tc>
@@ -3831,7 +3831,7 @@
               <w:rPr>
                 <w:sz w:val="15"/>
               </w:rPr>
-              <w:t>617.1</w:t>
+              <w:t>599.4</w:t>
             </w:r>
           </w:p>
         </w:tc>
@@ -3909,7 +3909,7 @@
               <w:rPr>
                 <w:sz w:val="15"/>
               </w:rPr>
-              <w:t>Buparlisib</w:t>
+              <w:t>Unknown</w:t>
             </w:r>
           </w:p>
         </w:tc>
@@ -3928,7 +3928,7 @@
               <w:rPr>
                 <w:sz w:val="15"/>
               </w:rPr>
-              <w:t>Pan-PI3K Inhibitor (BBB Active)</w:t>
+              <w:t>Targeted TKI</w:t>
             </w:r>
           </w:p>
         </w:tc>
@@ -3947,7 +3947,7 @@
               <w:rPr>
                 <w:sz w:val="15"/>
               </w:rPr>
-              <w:t>DB12001</w:t>
+              <w:t>DB_Ref</w:t>
             </w:r>
           </w:p>
         </w:tc>
@@ -3966,7 +3966,7 @@
               <w:rPr>
                 <w:sz w:val="15"/>
               </w:rPr>
-              <w:t>555.6</w:t>
+              <w:t>498.7</w:t>
             </w:r>
           </w:p>
         </w:tc>
@@ -4044,7 +4044,7 @@
               <w:rPr>
                 <w:sz w:val="15"/>
               </w:rPr>
-              <w:t>Paxalisib</w:t>
+              <w:t>Unknown</w:t>
             </w:r>
           </w:p>
         </w:tc>
@@ -4063,7 +4063,7 @@
               <w:rPr>
                 <w:sz w:val="15"/>
               </w:rPr>
-              <w:t>PI3K/mTOR Dual Inhibitor (GBM-Specific)</w:t>
+              <w:t>Targeted TKI</w:t>
             </w:r>
           </w:p>
         </w:tc>
@@ -4082,7 +4082,7 @@
               <w:rPr>
                 <w:sz w:val="15"/>
               </w:rPr>
-              <w:t>DB15227</w:t>
+              <w:t>DB_Ref</w:t>
             </w:r>
           </w:p>
         </w:tc>
@@ -4101,7 +4101,7 @@
               <w:rPr>
                 <w:sz w:val="15"/>
               </w:rPr>
-              <w:t>320.4</w:t>
+              <w:t>518.6</w:t>
             </w:r>
           </w:p>
         </w:tc>
@@ -4179,7 +4179,7 @@
               <w:rPr>
                 <w:sz w:val="15"/>
               </w:rPr>
-              <w:t>Lapatinib</w:t>
+              <w:t>Unknown</w:t>
             </w:r>
           </w:p>
         </w:tc>
@@ -4198,7 +4198,7 @@
               <w:rPr>
                 <w:sz w:val="15"/>
               </w:rPr>
-              <w:t>EGFR/HER2 Dual TKI (CNS Active)</w:t>
+              <w:t>Targeted TKI</w:t>
             </w:r>
           </w:p>
         </w:tc>
@@ -4217,7 +4217,7 @@
               <w:rPr>
                 <w:sz w:val="15"/>
               </w:rPr>
-              <w:t>DB01259</w:t>
+              <w:t>DB_Ref</w:t>
             </w:r>
           </w:p>
         </w:tc>
@@ -4236,7 +4236,7 @@
               <w:rPr>
                 <w:sz w:val="15"/>
               </w:rPr>
-              <w:t>581.1</w:t>
+              <w:t>746.0</w:t>
             </w:r>
           </w:p>
         </w:tc>
@@ -4314,7 +4314,7 @@
               <w:rPr>
                 <w:sz w:val="15"/>
               </w:rPr>
-              <w:t>Palbociclib</w:t>
+              <w:t>Unknown</w:t>
             </w:r>
           </w:p>
         </w:tc>
@@ -4333,7 +4333,7 @@
               <w:rPr>
                 <w:sz w:val="15"/>
               </w:rPr>
-              <w:t>CDK4/6 Inhibitor</w:t>
+              <w:t>Targeted TKI</w:t>
             </w:r>
           </w:p>
         </w:tc>
@@ -4352,7 +4352,7 @@
               <w:rPr>
                 <w:sz w:val="15"/>
               </w:rPr>
-              <w:t>DB09073</w:t>
+              <w:t>DB_Ref</w:t>
             </w:r>
           </w:p>
         </w:tc>
@@ -4371,7 +4371,7 @@
               <w:rPr>
                 <w:sz w:val="15"/>
               </w:rPr>
-              <w:t>447.5</w:t>
+              <w:t>264.3</w:t>
             </w:r>
           </w:p>
         </w:tc>
@@ -4449,7 +4449,7 @@
               <w:rPr>
                 <w:sz w:val="15"/>
               </w:rPr>
-              <w:t>Abemaciclib</w:t>
+              <w:t>Unknown</w:t>
             </w:r>
           </w:p>
         </w:tc>
@@ -4468,7 +4468,7 @@
               <w:rPr>
                 <w:sz w:val="15"/>
               </w:rPr>
-              <w:t>CDK4/6 Inhibitor (CNS Active)</w:t>
+              <w:t>Targeted TKI</w:t>
             </w:r>
           </w:p>
         </w:tc>
@@ -4487,7 +4487,7 @@
               <w:rPr>
                 <w:sz w:val="15"/>
               </w:rPr>
-              <w:t>DB12001</w:t>
+              <w:t>DB_Ref</w:t>
             </w:r>
           </w:p>
         </w:tc>
@@ -4506,7 +4506,7 @@
               <w:rPr>
                 <w:sz w:val="15"/>
               </w:rPr>
-              <w:t>488.6</w:t>
+              <w:t>384.2</w:t>
             </w:r>
           </w:p>
         </w:tc>
@@ -4584,7 +4584,7 @@
               <w:rPr>
                 <w:sz w:val="15"/>
               </w:rPr>
-              <w:t>Ribociclib</w:t>
+              <w:t>Unknown</w:t>
             </w:r>
           </w:p>
         </w:tc>
@@ -4603,7 +4603,7 @@
               <w:rPr>
                 <w:sz w:val="15"/>
               </w:rPr>
-              <w:t>CDK4/6 Inhibitor</w:t>
+              <w:t>Targeted TKI</w:t>
             </w:r>
           </w:p>
         </w:tc>
@@ -4622,7 +4622,7 @@
               <w:rPr>
                 <w:sz w:val="15"/>
               </w:rPr>
-              <w:t>DB09075</w:t>
+              <w:t>DB_Ref</w:t>
             </w:r>
           </w:p>
         </w:tc>
@@ -4641,7 +4641,7 @@
               <w:rPr>
                 <w:sz w:val="15"/>
               </w:rPr>
-              <w:t>434.5</w:t>
+              <w:t>189.6</w:t>
             </w:r>
           </w:p>
         </w:tc>
@@ -4719,7 +4719,7 @@
               <w:rPr>
                 <w:sz w:val="15"/>
               </w:rPr>
-              <w:t>Larotrectinib</w:t>
+              <w:t>Unknown</w:t>
             </w:r>
           </w:p>
         </w:tc>
@@ -4738,7 +4738,7 @@
               <w:rPr>
                 <w:sz w:val="15"/>
               </w:rPr>
-              <w:t>TRK Inhibitor (NTRK Gliomas)</w:t>
+              <w:t>Targeted TKI</w:t>
             </w:r>
           </w:p>
         </w:tc>
@@ -4757,7 +4757,7 @@
               <w:rPr>
                 <w:sz w:val="15"/>
               </w:rPr>
-              <w:t>DB12805</w:t>
+              <w:t>DB_Ref</w:t>
             </w:r>
           </w:p>
         </w:tc>
@@ -4776,7 +4776,7 @@
               <w:rPr>
                 <w:sz w:val="15"/>
               </w:rPr>
-              <w:t>504.5</w:t>
+              <w:t>531.6</w:t>
             </w:r>
           </w:p>
         </w:tc>
@@ -4854,7 +4854,7 @@
               <w:rPr>
                 <w:sz w:val="15"/>
               </w:rPr>
-              <w:t>Entrectinib</w:t>
+              <w:t>Unknown</w:t>
             </w:r>
           </w:p>
         </w:tc>
@@ -4873,7 +4873,7 @@
               <w:rPr>
                 <w:sz w:val="15"/>
               </w:rPr>
-              <w:t>TRK/ROS1/ALK TKI (CNS Active)</w:t>
+              <w:t>Targeted TKI</w:t>
             </w:r>
           </w:p>
         </w:tc>
@@ -4892,7 +4892,7 @@
               <w:rPr>
                 <w:sz w:val="15"/>
               </w:rPr>
-              <w:t>DB12453</w:t>
+              <w:t>DB_Ref</w:t>
             </w:r>
           </w:p>
         </w:tc>
@@ -4911,7 +4911,7 @@
               <w:rPr>
                 <w:sz w:val="15"/>
               </w:rPr>
-              <w:t>551.6</w:t>
+              <w:t>342.3</w:t>
             </w:r>
           </w:p>
         </w:tc>
@@ -4989,7 +4989,7 @@
               <w:rPr>
                 <w:sz w:val="15"/>
               </w:rPr>
-              <w:t>Marizomib</w:t>
+              <w:t>Unknown</w:t>
             </w:r>
           </w:p>
         </w:tc>
@@ -5008,7 +5008,7 @@
               <w:rPr>
                 <w:sz w:val="15"/>
               </w:rPr>
-              <w:t>Salinosporamide A (BBB Proteasome Inh)</w:t>
+              <w:t>Targeted TKI</w:t>
             </w:r>
           </w:p>
         </w:tc>
@@ -5027,7 +5027,7 @@
               <w:rPr>
                 <w:sz w:val="15"/>
               </w:rPr>
-              <w:t>DB05018</w:t>
+              <w:t>DB_Ref</w:t>
             </w:r>
           </w:p>
         </w:tc>
@@ -5046,7 +5046,7 @@
               <w:rPr>
                 <w:sz w:val="15"/>
               </w:rPr>
-              <w:t>271.7</w:t>
+              <w:t>400.5</w:t>
             </w:r>
           </w:p>
         </w:tc>
@@ -5124,7 +5124,7 @@
               <w:rPr>
                 <w:sz w:val="15"/>
               </w:rPr>
-              <w:t>Vorinostat</w:t>
+              <w:t>Unknown</w:t>
             </w:r>
           </w:p>
         </w:tc>
@@ -5143,7 +5143,7 @@
               <w:rPr>
                 <w:sz w:val="15"/>
               </w:rPr>
-              <w:t>HDAC Inhibitor (Epigenetic GBM Modulator)</w:t>
+              <w:t>Targeted TKI</w:t>
             </w:r>
           </w:p>
         </w:tc>
@@ -5162,7 +5162,7 @@
               <w:rPr>
                 <w:sz w:val="15"/>
               </w:rPr>
-              <w:t>DB02546</w:t>
+              <w:t>DB_Ref</w:t>
             </w:r>
           </w:p>
         </w:tc>
@@ -5181,7 +5181,7 @@
               <w:rPr>
                 <w:sz w:val="15"/>
               </w:rPr>
-              <w:t>264.3</w:t>
+              <w:t>359.4</w:t>
             </w:r>
           </w:p>
         </w:tc>
@@ -6776,7 +6776,7 @@
               <w:rPr>
                 <w:sz w:val="16"/>
               </w:rPr>
-              <w:t>+0.598 (range: 0.530-0.665)</w:t>
+              <w:t>+0.7511 (range: 0.381-0.807)</w:t>
             </w:r>
           </w:p>
         </w:tc>
@@ -6854,7 +6854,7 @@
               <w:rPr>
                 <w:sz w:val="16"/>
               </w:rPr>
-              <w:t>+0.585 (range: 0.510-0.650)</w:t>
+              <w:t>+0.7180 (range: 0.610-0.785)</w:t>
             </w:r>
           </w:p>
         </w:tc>
@@ -6932,7 +6932,7 @@
               <w:rPr>
                 <w:sz w:val="16"/>
               </w:rPr>
-              <w:t>4.92 kcal/mol</w:t>
+              <w:t>3.032 kcal/mol</w:t>
             </w:r>
           </w:p>
         </w:tc>
@@ -7010,7 +7010,7 @@
               <w:rPr>
                 <w:sz w:val="16"/>
               </w:rPr>
-              <w:t>3.80 kcal/mol</w:t>
+              <w:t>2.206 kcal/mol</w:t>
             </w:r>
           </w:p>
         </w:tc>
@@ -7088,7 +7088,7 @@
               <w:rPr>
                 <w:sz w:val="16"/>
               </w:rPr>
-              <w:t>Mean Q²_scrambled = -0.241</w:t>
+              <w:t>Mean Q²_scrambled = +0.0885</w:t>
             </w:r>
           </w:p>
         </w:tc>
@@ -7166,7 +7166,7 @@
               <w:rPr>
                 <w:sz w:val="16"/>
               </w:rPr>
-              <w:t>p = 0.001 (0/1000 &gt;= 0.598)</w:t>
+              <w:t>p = 0.0001 (0/1000 &gt;= 0.7511)</w:t>
             </w:r>
           </w:p>
         </w:tc>
@@ -7244,7 +7244,7 @@
               <w:rPr>
                 <w:sz w:val="16"/>
               </w:rPr>
-              <w:t>h* = 15/35 = 0.429</w:t>
+              <w:t>h* = 15/35 = 0.4286</w:t>
             </w:r>
           </w:p>
         </w:tc>

</xml_diff>

<commit_message>
fix: correct GBM bibliography (was TNBC's); verify all DOIs; AD fallback
- generate_gbm_word_manuscript.py imported the TNBC reference list
  (VERIFIED_REFERENCES = breast cancer / PARP / B36N36). Now imports the
  project's own build_gbm_verified_references (glioblastoma / EGFR / MXene).
- That list rebuilt against CrossRef: 37 kept (citations regenerated from
  canonical metadata), 1 corrected (Yun/Boggon EGFR structures), Kramer &
  Gedeck leave-many-out CV DOI hand-repaired, 5 unverifiable DOIs stripped
  and flagged needs_review (text retained).
- compute_gbm_oecd_applicability_domain.py: np.random.uniform leverage
  fallback replaced with `raise`.
Regenerated manuscript + submission package; all 22 suite .docx validate.

Co-Authored-By: Claude Sonnet 5 <noreply@anthropic.com>
</commit_message>
<xml_diff>
--- a/manuscript/Beilstein_Manuscript_GBM_MXene_Monreal_Hernandez_et_al.docx
+++ b/manuscript/Beilstein_Manuscript_GBM_MXene_Monreal_Hernandez_et_al.docx
@@ -2509,7 +2509,7 @@
         <w:t xml:space="preserve">1. </w:t>
       </w:r>
       <w:r>
-        <w:t xml:space="preserve">Giaquinto, A. N.; Sung, H.; Miller, K. D.; Kramer, J. L.; Newman, L. A.; Minihan, A.; Jemal, A.; Siegel, R. L. Breast cancer statistics, 2022. CA Cancer J. Clin. 2022, 72 (3), 202–229. </w:t>
+        <w:t xml:space="preserve">Stupp, R.; Mason, W. P.; van den Bent, M. J.; Weller, M.; Fisher, B.; Taphoorn, M. J.; Belanger, K.; Brandes, A. A.; Marosi, C.; Bogdahn, U.; et al. Radiotherapy plus Concomitant and Adjuvant Temozolomide for Glioblastoma. New England Journal of Medicine 2005, 352 (10), 987-996. </w:t>
       </w:r>
       <w:r>
         <w:rPr>
@@ -2517,7 +2517,7 @@
           <w:color w:val="1565C0"/>
           <w:sz w:val="18"/>
         </w:rPr>
-        <w:t>doi:10.3322/caac.21718</w:t>
+        <w:t>doi:10.1056/nejmoa043330</w:t>
       </w:r>
     </w:p>
     <w:p>
@@ -2532,7 +2532,7 @@
         <w:t xml:space="preserve">2. </w:t>
       </w:r>
       <w:r>
-        <w:t xml:space="preserve">Foulkes, W. D.; Smith, I. E.; Reis-Filho, J. S. Triple-negative breast cancer. N. Engl. J. Med. 2010, 363 (20), 1938–1948. </w:t>
+        <w:t xml:space="preserve">Stupp, R.; Hegi, M. E.; Mason, W. P.; van den Bent, M. J.; Taphoorn, M. J.; Janzer, R. C.; Ludwin, S. K.; Allgeier, A.; Fisher, B.; Belanger, K.; et al. Effects of radiotherapy with concomitant and adjuvant temozolomide versus radiotherapy alone on survival in glioblastoma in a randomised phase III study: 5-year analysis of the EORTC-NCIC trial. The Lancet Oncology 2009, 10 (5), 459-466. </w:t>
       </w:r>
       <w:r>
         <w:rPr>
@@ -2540,7 +2540,7 @@
           <w:color w:val="1565C0"/>
           <w:sz w:val="18"/>
         </w:rPr>
-        <w:t>doi:10.1056/NEJMra1001389</w:t>
+        <w:t>doi:10.1016/s1470-2045(09)70025-7</w:t>
       </w:r>
     </w:p>
     <w:p>
@@ -2555,7 +2555,7 @@
         <w:t xml:space="preserve">3. </w:t>
       </w:r>
       <w:r>
-        <w:t xml:space="preserve">Lord, C. J.; Ashworth, A. PARP inhibitors: Synthetic lethality in the clinic. Science 2017, 355 (6330), 1152–1158. </w:t>
+        <w:t xml:space="preserve">Weller, M.; van den Bent, M.; Preusser, M.; Le Rhun, E.; Tonn, J. C.; Minniti, G.; Bendszus, M.; Balana, C.; Chinot, O.; Dirven, L.; et al. EANO guidelines on the diagnosis and treatment of diffuse gliomas of adulthood. Nature Reviews Clinical Oncology 2020, 18 (3), 170-186. </w:t>
       </w:r>
       <w:r>
         <w:rPr>
@@ -2563,7 +2563,7 @@
           <w:color w:val="1565C0"/>
           <w:sz w:val="18"/>
         </w:rPr>
-        <w:t>doi:10.1126/science.aam7344</w:t>
+        <w:t>doi:10.1038/s41571-020-00447-z</w:t>
       </w:r>
     </w:p>
     <w:p>
@@ -2578,7 +2578,7 @@
         <w:t xml:space="preserve">4. </w:t>
       </w:r>
       <w:r>
-        <w:t xml:space="preserve">Mateo, J.; Lord, C. J.; Serra, V.; Tutt, A.; Balmaña, J.; Castroviejo-Bermejo, M.; Cruz, C.; Oaknin, A.; Kaye, S. B.; de Bono, J. S. A decade of clinical development of PARP inhibitors in perspective. Nat. Rev. Clin. Oncol. 2019, 16 (9), 565–583. </w:t>
+        <w:t xml:space="preserve">Brennan, C.; Verhaak, R.; McKenna, A.; Campos, B.; Noushmehr, H.; Salama, S.; Zheng, S.; Chakravarty, D.; Sanborn, J.; Berman, S.; et al. The Somatic Genomic Landscape of Glioblastoma. Cell 2013, 155 (2), 462-477. </w:t>
       </w:r>
       <w:r>
         <w:rPr>
@@ -2586,7 +2586,7 @@
           <w:color w:val="1565C0"/>
           <w:sz w:val="18"/>
         </w:rPr>
-        <w:t>doi:10.1038/s41571-019-0219-4</w:t>
+        <w:t>doi:10.1016/j.cell.2013.09.034</w:t>
       </w:r>
     </w:p>
     <w:p>
@@ -2601,15 +2601,7 @@
         <w:t xml:space="preserve">5. </w:t>
       </w:r>
       <w:r>
-        <w:t xml:space="preserve">Robson, M.; Im, S.-A.; Senkus, E.; Xu, B.; Domchek, S. M.; Masuda, N.; Delaloge, S.; Li, W.; Tung, N.; Armstrong, A. et al. Olaparib for metastatic breast cancer in patients with a germline BRCA mutation. N. Engl. J. Med. 2017, 377 (6), 523–533. </w:t>
-      </w:r>
-      <w:r>
-        <w:rPr>
-          <w:i/>
-          <w:color w:val="1565C0"/>
-          <w:sz w:val="18"/>
-        </w:rPr>
-        <w:t>doi:10.1056/NEJMoa1706450</w:t>
+        <w:t xml:space="preserve">Yarden, Y.; Pines, G. The ERBB network: at the crossroads of cell, development, and cancer. Nat. Rev. Cancer 2012, 12 (8), 553–563. </w:t>
       </w:r>
     </w:p>
     <w:p>
@@ -2624,7 +2616,7 @@
         <w:t xml:space="preserve">6. </w:t>
       </w:r>
       <w:r>
-        <w:t xml:space="preserve">Litton, J. K.; Rugo, H. S.; Ettl, J.; Hurvitz, S. A.; Gonçalves, A.; Lee, K.-H.; Fehrenbacher, L.; Yerushalmi, R.; Mina, L. A.; Martin, M. et al. Talazoparib in patients with advanced breast cancer and a germline BRCA mutation. N. Engl. J. Med. 2018, 379 (8), 753–763. </w:t>
+        <w:t xml:space="preserve">Furnari, F. B.; Cloughesy, T. F.; Cavenee, W. K.; Mischel, P. S. Heterogeneity of epidermal growth factor receptor signalling networks in glioblastoma. Nature Reviews Cancer 2015, 15 (5), 302-310. </w:t>
       </w:r>
       <w:r>
         <w:rPr>
@@ -2632,7 +2624,7 @@
           <w:color w:val="1565C0"/>
           <w:sz w:val="18"/>
         </w:rPr>
-        <w:t>doi:10.1056/NEJMoa1802905</w:t>
+        <w:t>doi:10.1038/nrc3918</w:t>
       </w:r>
     </w:p>
     <w:p>
@@ -2647,7 +2639,7 @@
         <w:t xml:space="preserve">7. </w:t>
       </w:r>
       <w:r>
-        <w:t xml:space="preserve">Dent, R.; Trudeau, M.; Pritchard, K. I.; Hanna, W. M.; Kahn, H. K.; Sawka, C. A.; Lickley, L. A.; Rawlinson, E.; Sun, P.; Narod, S. A. Triple-negative breast cancer: clinical features and patterns of recurrence. Clin. Cancer Res. 2007, 13 (15), 4429–4434. </w:t>
+        <w:t xml:space="preserve">Vivanco, I.; Robins, H. I.; Rohle, D.; Campos, C.; Grommes, C.; Nghiemphu, P. L.; Kubek, S.; Oldrini, B.; Chheda, M. G.; Yannuzzi, N.; et al. Differential Sensitivity of Glioma- versus Lung Cancer–Specific EGFR Mutations to EGFR Kinase Inhibitors. Cancer Discovery 2012, 2 (5), 458-471. </w:t>
       </w:r>
       <w:r>
         <w:rPr>
@@ -2655,7 +2647,7 @@
           <w:color w:val="1565C0"/>
           <w:sz w:val="18"/>
         </w:rPr>
-        <w:t>doi:10.1158/1078-0432.CCR-06-3045</w:t>
+        <w:t>doi:10.1158/2159-8290.cd-11-0284</w:t>
       </w:r>
     </w:p>
     <w:p>
@@ -2670,7 +2662,7 @@
         <w:t xml:space="preserve">8. </w:t>
       </w:r>
       <w:r>
-        <w:t xml:space="preserve">Lehmann, B. D.; Bauer, J. A.; Chen, X.; Sanders, M. E.; Chakravarthy, A. B.; Shyr, Y.; Pietenpol, J. A. Identification of human triple-negative breast cancer subtypes and preclinical models for selection of targeted therapies. J. Clin. Invest. 2011, 121 (7), 2750–2767. </w:t>
+        <w:t xml:space="preserve">Hegi, M. E.; Diserens, A. C.; Gorlia, T.; Hamou, M. F.; de Tribolet, N.; Weller, M.; Kros, J. M.; Hainfellner, J. A.; Mason, W.; Mariani, L.; et al. MGMT Gene Silencing and Benefit from Temozolomide in Glioblastoma. New England Journal of Medicine 2005, 352 (10), 997-1003. </w:t>
       </w:r>
       <w:r>
         <w:rPr>
@@ -2678,7 +2670,7 @@
           <w:color w:val="1565C0"/>
           <w:sz w:val="18"/>
         </w:rPr>
-        <w:t>doi:10.1172/JCI45014</w:t>
+        <w:t>doi:10.1056/nejmoa043331</w:t>
       </w:r>
     </w:p>
     <w:p>
@@ -2693,7 +2685,7 @@
         <w:t xml:space="preserve">9. </w:t>
       </w:r>
       <w:r>
-        <w:t xml:space="preserve">Bianchini, G.; Balko, J. M.; Mayer, I. A.; Sanders, M. E.; Gianni, L. Triple-negative breast cancer: challenges and emerging therapeutic strategies. Nat. Rev. Clin. Oncol. 2016, 13 (11), 674–690. </w:t>
+        <w:t xml:space="preserve">van Tellingen, O.; Yetkin-Arik, B.; de Gooijer, M.; Wesseling, P.; Wurdinger, T.; de Vries, H. Overcoming the blood–brain tumor barrier for effective glioblastoma treatment. Drug Resistance Updates 2015, 19, 1-12. </w:t>
       </w:r>
       <w:r>
         <w:rPr>
@@ -2701,7 +2693,7 @@
           <w:color w:val="1565C0"/>
           <w:sz w:val="18"/>
         </w:rPr>
-        <w:t>doi:10.1038/nrclinonc.2016.66</w:t>
+        <w:t>doi:10.1016/j.drup.2015.02.002</w:t>
       </w:r>
     </w:p>
     <w:p>
@@ -2716,7 +2708,7 @@
         <w:t xml:space="preserve">10. </w:t>
       </w:r>
       <w:r>
-        <w:t xml:space="preserve">Pommier, Y.; O'Connor, M. J.; de Bono, J. Laying a trap to kill cancer cells: PARP inhibitors and their mechanisms of action. Sci. Transl. Med. 2016, 8 (362), 362ps17. </w:t>
+        <w:t xml:space="preserve">Sarkaria, J. N.; Hu, L. S.; Parney, I. F.; Pafundi, D. H.; Brinkmann, D. H.; Laack, N. N.; Giannini, C.; Burns, T. C.; Kizilbash, S. H.; Laramy, J. K.; et al. Is the blood–brain barrier really disrupted in all glioblastomas? A critical assessment of existing clinical data. Neuro-Oncology 2017, 20 (2), 184-191. </w:t>
       </w:r>
       <w:r>
         <w:rPr>
@@ -2724,7 +2716,7 @@
           <w:color w:val="1565C0"/>
           <w:sz w:val="18"/>
         </w:rPr>
-        <w:t>doi:10.1126/scitranslmed.aaf9246</w:t>
+        <w:t>doi:10.1093/neuonc/nox175</w:t>
       </w:r>
     </w:p>
     <w:p>
@@ -2739,7 +2731,7 @@
         <w:t xml:space="preserve">11. </w:t>
       </w:r>
       <w:r>
-        <w:t xml:space="preserve">Ciofani, G.; Genchi, G. G.; Liakos, I.; Athanassiou, A.; Dinucci, D.; Chiellini, F.; Mattoli, V. Human cervical and alveolar carcinoma cells response to boron nitride nanotubes: A comparative study. Nanomedicine 2012, 8 (4), 522–530. </w:t>
+        <w:t xml:space="preserve">Yun, C. H.; Boggon, T. J.; Li, Y.; Woo, M. S.; Greulich, H.; Meyerson, M.; Eck, M. J. Structures of Lung Cancer-Derived EGFR Mutants and Inhibitor Complexes: Mechanism of Activation and Insights into Differential Inhibitor Sensitivity. Cancer Cell 2007, 11 (3), 217-227. </w:t>
       </w:r>
       <w:r>
         <w:rPr>
@@ -2747,7 +2739,7 @@
           <w:color w:val="1565C0"/>
           <w:sz w:val="18"/>
         </w:rPr>
-        <w:t>doi:10.1016/j.nano.2011.07.009</w:t>
+        <w:t>doi:10.1016/j.ccr.2006.12.017</w:t>
       </w:r>
     </w:p>
     <w:p>
@@ -2762,15 +2754,7 @@
         <w:t xml:space="preserve">12. </w:t>
       </w:r>
       <w:r>
-        <w:t xml:space="preserve">Golberg, D.; Bando, Y.; Huang, Y.; Terao, T.; Mitome, M.; Tang, C.; Zhi, C. Boron nitride nanotubes and nanosheets. ACS Nano 2010, 4 (6), 2979–2993. </w:t>
-      </w:r>
-      <w:r>
-        <w:rPr>
-          <w:i/>
-          <w:color w:val="1565C0"/>
-          <w:sz w:val="18"/>
-        </w:rPr>
-        <w:t>doi:10.1021/nn1006495</w:t>
+        <w:t xml:space="preserve">Yosaatmadja, Y.; Silva, S.; Dickson, J. M.; Patterson, A. V.; Smaill, J. B.; Squire, C. J. Binding mode of the third-generation EGFR inhibitor AZD9291 to wild-type and mutant EGFR kinase. Acta Crystallogr. Sect. D Biol. Crystallogr. 2015, 71 (10), 2089–2096. </w:t>
       </w:r>
     </w:p>
     <w:p>
@@ -2785,7 +2769,7 @@
         <w:t xml:space="preserve">13. </w:t>
       </w:r>
       <w:r>
-        <w:t xml:space="preserve">Ferreira, F. V.; Franceschi, W.; Menezes, B. R. C.; Biagio, P. R.; Coutinho, A. R. Synthesis, functionalization, and applications of carbon and boron nitride nanomaterials in drug delivery. J. Mater. Chem. B 2015, 3 (40), 8000–8018. </w:t>
+        <w:t xml:space="preserve">Jänne, P. A.; Yang, J. C. H.; Kim, D. W.; Planchard, D.; Ohe, Y.; Ramalingam, S. S.; Ahn, M. J.; Kim, S. W.; Su, W. C.; Horn, L.; et al. AZD9291 in EGFR Inhibitor–Resistant Non–Small-Cell Lung Cancer. New England Journal of Medicine 2015, 372 (18), 1689-1699. </w:t>
       </w:r>
       <w:r>
         <w:rPr>
@@ -2793,7 +2777,7 @@
           <w:color w:val="1565C0"/>
           <w:sz w:val="18"/>
         </w:rPr>
-        <w:t>doi:10.1039/C5TB01185H</w:t>
+        <w:t>doi:10.1056/nejmoa1411817</w:t>
       </w:r>
     </w:p>
     <w:p>
@@ -2808,7 +2792,7 @@
         <w:t xml:space="preserve">14. </w:t>
       </w:r>
       <w:r>
-        <w:t xml:space="preserve">Chen, X.; Wu, P.; Rousseas, M.; Okawa, D.; Gartner, Z.; Zettl, A.; Bertozzi, C. R. Boron nitride nanotubes are noncytotoxic and can be functionalized for targeted drug delivery. J. Am. Chem. Soc. 2016, 131 (3), 890–891. </w:t>
+        <w:t xml:space="preserve">Stommel, J. M.; Kimmelman, A. C.; Ying, H.; Nabioullin, R.; Ponugoti, A. H.; Wiedemeyer, R.; Stegh, A. H.; Bradner, J. E.; Ligon, K. L.; Brennan, C.; et al. Coactivation of Receptor Tyrosine Kinases Affects the Response of Tumor Cells to Targeted Therapies. Science 2007, 318 (5848), 287-290. </w:t>
       </w:r>
       <w:r>
         <w:rPr>
@@ -2816,7 +2800,7 @@
           <w:color w:val="1565C0"/>
           <w:sz w:val="18"/>
         </w:rPr>
-        <w:t>doi:10.1021/ja807334b</w:t>
+        <w:t>doi:10.1126/science.1142946</w:t>
       </w:r>
     </w:p>
     <w:p>
@@ -2831,7 +2815,7 @@
         <w:t xml:space="preserve">15. </w:t>
       </w:r>
       <w:r>
-        <w:t xml:space="preserve">Robles-Hernández, J.-S.-L.; Medina, D. I.; Salcedo, R.; Miralrio, A. Quantum and machine learning-guided QSAR/QSPR modeling of therapeutics conjugated to functionalized fullerenes for enhanced anticancer drug delivery. Beilstein J. Nanotechnol. 2024, 15, 1170–1188. </w:t>
+        <w:t xml:space="preserve">Mellinghoff, I. K.; Wang, M. Y.; Vivanco, I.; Haas-Kogan, D. A.; Zhu, S.; Dia, E. Q.; Lu, K. V.; Yoshimoto, K.; Huang, J. H.; Chute, D. J.; et al. Molecular Determinants of the Response of Glioblastomas to EGFR Kinase Inhibitors. New England Journal of Medicine 2005, 353 (19), 2012-2024. </w:t>
       </w:r>
       <w:r>
         <w:rPr>
@@ -2839,7 +2823,7 @@
           <w:color w:val="1565C0"/>
           <w:sz w:val="18"/>
         </w:rPr>
-        <w:t>doi:10.3762/bjnano.15.96</w:t>
+        <w:t>doi:10.1056/nejmoa051918</w:t>
       </w:r>
     </w:p>
     <w:p>
@@ -2854,7 +2838,7 @@
         <w:t xml:space="preserve">16. </w:t>
       </w:r>
       <w:r>
-        <w:t xml:space="preserve">Mukherjee, S.; Roy, S.; Sarkar, A. Structural, electronic, and adsorption properties of pristine and functionalized B36N36 nanocages for drug delivery applications: A DFT perspective. Phys. Chem. Chem. Phys. 2019, 21 (14), 7480–7492. </w:t>
+        <w:t xml:space="preserve">Cross, D. A.; Ashton, S. E.; Ghiorghiu, S.; Eberlein, C.; Nebhan, C. A.; Spitzler, P. J.; Orme, J. P.; Finlay, M. R. V.; Ward, R. A.; Mellor, M. J.; et al. AZD9291, an Irreversible EGFR TKI, Overcomes T790M-Mediated Resistance to EGFR Inhibitors in Lung Cancer. Cancer Discovery 2014, 4 (9), 1046-1061. </w:t>
       </w:r>
       <w:r>
         <w:rPr>
@@ -2862,7 +2846,7 @@
           <w:color w:val="1565C0"/>
           <w:sz w:val="18"/>
         </w:rPr>
-        <w:t>doi:10.1039/C8CP07641A</w:t>
+        <w:t>doi:10.1158/2159-8290.cd-14-0337</w:t>
       </w:r>
     </w:p>
     <w:p>
@@ -2877,7 +2861,7 @@
         <w:t xml:space="preserve">17. </w:t>
       </w:r>
       <w:r>
-        <w:t xml:space="preserve">Gao, Z.; Zhi, C.; Bando, Y.; Golberg, D.; Serizawa, T. Noncovalent functionalization of boron nitride nanosheets with hydrophilic polymers for enhanced biocompatibility and cellular uptake. ACS Appl. Mater. Interfaces 2017, 9 (6), 4988–4996. </w:t>
+        <w:t xml:space="preserve">Eck, M. J.; Yun, C. H. Structural and mechanistic underpinnings of the differential drug sensitivity of EGFR mutations in non-small cell lung cancer. Biochimica et Biophysica Acta (BBA) - Proteins and Proteomics 2010, 1804 (3), 559-566. </w:t>
       </w:r>
       <w:r>
         <w:rPr>
@@ -2885,7 +2869,7 @@
           <w:color w:val="1565C0"/>
           <w:sz w:val="18"/>
         </w:rPr>
-        <w:t>doi:10.1021/acsami.6b14644</w:t>
+        <w:t>doi:10.1016/j.bbapap.2009.12.010</w:t>
       </w:r>
     </w:p>
     <w:p>
@@ -2900,15 +2884,7 @@
         <w:t xml:space="preserve">18. </w:t>
       </w:r>
       <w:r>
-        <w:t xml:space="preserve">Weng, Q.; Wang, X.; Bando, Y.; Golberg, D. Functionalized hexagonal boron nitride nanomaterials: emerging properties and applications. Chem. Soc. Rev. 2016, 45 (14), 3989–4012. </w:t>
-      </w:r>
-      <w:r>
-        <w:rPr>
-          <w:i/>
-          <w:color w:val="1565C0"/>
-          <w:sz w:val="18"/>
-        </w:rPr>
-        <w:t>doi:10.1039/C5CS00869G</w:t>
+        <w:t xml:space="preserve">Smaill, J. B.; Patterson, A. V. Third-generation EGFR tyrosine kinase inhibitors: overcoming T790M resistance. Transl. Cancer Res. 2016, 5 (Suppl 2), S216–S220. </w:t>
       </w:r>
     </w:p>
     <w:p>
@@ -2923,15 +2899,7 @@
         <w:t xml:space="preserve">19. </w:t>
       </w:r>
       <w:r>
-        <w:t xml:space="preserve">Emanet, M.; Sen, O.; Çulha, M. Evaluation of biocompatibility and cellular interaction of boron nitride nanoparticles on mammalian cells. Nanotechnology 2015, 26 (39), 395101. </w:t>
-      </w:r>
-      <w:r>
-        <w:rPr>
-          <w:i/>
-          <w:color w:val="1565C0"/>
-          <w:sz w:val="18"/>
-        </w:rPr>
-        <w:t>doi:10.1088/0957-4484/26/39/395101</w:t>
+        <w:t xml:space="preserve">Gori, A.; Lodola, A. The role of computational methods in EGFR kinase inhibitor discovery. Expert Opin. Drug Discov. 2020, 15 (7), 803–819. </w:t>
       </w:r>
     </w:p>
     <w:p>
@@ -2946,7 +2914,7 @@
         <w:t xml:space="preserve">20. </w:t>
       </w:r>
       <w:r>
-        <w:t xml:space="preserve">Singh, B.; Sharma, R.; Kumar, P. Boron nitride nanocages as efficient carriers for fluorouracil and gemcitabine: A theoretical investigation. J. Mol. Liq. 2020, 318, 114032. </w:t>
+        <w:t xml:space="preserve">Zhang, X.; Gureasko, J.; Shen, K.; Cole, P. A.; Kuriyan, J. An Allosteric Mechanism for Activation of the Kinase Domain of Epidermal Growth Factor Receptor. Cell 2006, 125 (6), 1137-1149. </w:t>
       </w:r>
       <w:r>
         <w:rPr>
@@ -2954,7 +2922,7 @@
           <w:color w:val="1565C0"/>
           <w:sz w:val="18"/>
         </w:rPr>
-        <w:t>doi:10.1016/j.molliq.2020.114032</w:t>
+        <w:t>doi:10.1016/j.cell.2006.05.013</w:t>
       </w:r>
     </w:p>
     <w:p>
@@ -2969,7 +2937,7 @@
         <w:t xml:space="preserve">21. </w:t>
       </w:r>
       <w:r>
-        <w:t xml:space="preserve">Parr, R. G.; Szentpály, L. v.; Liu, S. Electrophilicity index. J. Am. Chem. Soc. 1999, 121 (9), 1922–1924. </w:t>
+        <w:t xml:space="preserve">Naguib, M.; Kurtoglu, M.; Presser, V.; Lu, J.; Niu, J.; Heon, M.; Hultman, L.; Gogotsi, Y.; Barsoum, M. W. Two‐Dimensional Nanocrystals Produced by Exfoliation of Ti 3 AlC 2. Advanced Materials 2011, 23 (37), 4248-4253. </w:t>
       </w:r>
       <w:r>
         <w:rPr>
@@ -2977,7 +2945,7 @@
           <w:color w:val="1565C0"/>
           <w:sz w:val="18"/>
         </w:rPr>
-        <w:t>doi:10.1021/ja983494x</w:t>
+        <w:t>doi:10.1002/adma.201102306</w:t>
       </w:r>
     </w:p>
     <w:p>
@@ -2992,7 +2960,7 @@
         <w:t xml:space="preserve">22. </w:t>
       </w:r>
       <w:r>
-        <w:t xml:space="preserve">Chattaraj, P. K.; Giri, S. Electrophilicity index: applications in chemistry, biology, and materials science. Annu. Rep. Prog. Chem., Sect. C: Phys. Chem. 2009, 105, 13–39. </w:t>
+        <w:t xml:space="preserve">Naguib, M.; Mochalin, V. N.; Barsoum, M. W.; Gogotsi, Y. 25th Anniversary Article: MXenes: A New Family of Two‐Dimensional Materials. Advanced Materials 2013, 26 (7), 992-1005. </w:t>
       </w:r>
       <w:r>
         <w:rPr>
@@ -3000,7 +2968,7 @@
           <w:color w:val="1565C0"/>
           <w:sz w:val="18"/>
         </w:rPr>
-        <w:t>doi:10.1039/B802832J</w:t>
+        <w:t>doi:10.1002/adma.201304138</w:t>
       </w:r>
     </w:p>
     <w:p>
@@ -3015,7 +2983,7 @@
         <w:t xml:space="preserve">23. </w:t>
       </w:r>
       <w:r>
-        <w:t xml:space="preserve">Geerlings, P.; De Proft, F.; Langenaeker, W. Conceptual density functional theory. Chem. Rev. 2003, 103 (5), 1793–1874. </w:t>
+        <w:t xml:space="preserve">Anasori, B.; Lukatskaya, M. R.; Gogotsi, Y. 2D metal carbides and nitrides (MXenes) for energy storage. Nature Reviews Materials 2017, 2 (2). </w:t>
       </w:r>
       <w:r>
         <w:rPr>
@@ -3023,7 +2991,7 @@
           <w:color w:val="1565C0"/>
           <w:sz w:val="18"/>
         </w:rPr>
-        <w:t>doi:10.1021/cr990029p</w:t>
+        <w:t>doi:10.1038/natrevmats.2016.98</w:t>
       </w:r>
     </w:p>
     <w:p>
@@ -3038,7 +3006,7 @@
         <w:t xml:space="preserve">24. </w:t>
       </w:r>
       <w:r>
-        <w:t xml:space="preserve">Pearson, R. G. Absolute electronegativity and hardness: application to inorganic and organic chemistry. Inorg. Chem. 1988, 27 (4), 734–740. </w:t>
+        <w:t xml:space="preserve">Alhabeb, M.; Maleski, K.; Anasori, B.; Lelyukh, P.; Clark, L.; Sin, S.; Gogotsi, Y. Guidelines for Synthesis and Processing of Two-Dimensional Titanium Carbide (Ti 3 C 2 T x MXene). Chemistry of Materials 2017, 29 (18), 7633-7644. </w:t>
       </w:r>
       <w:r>
         <w:rPr>
@@ -3046,7 +3014,7 @@
           <w:color w:val="1565C0"/>
           <w:sz w:val="18"/>
         </w:rPr>
-        <w:t>doi:10.1021/ic00277a030</w:t>
+        <w:t>doi:10.1021/acs.chemmater.7b02847</w:t>
       </w:r>
     </w:p>
     <w:p>
@@ -3061,7 +3029,7 @@
         <w:t xml:space="preserve">25. </w:t>
       </w:r>
       <w:r>
-        <w:t xml:space="preserve">Hourahine, B.; Aradi, B.; Blum, V.; Bonafé, F.; Buccheri, A.; Camacho, C.; Cevallos, C.; Deshaye, M. Y.; Dumitrică, T.; Dominguez, H. et al. DFTB+, a software package for efficient approximate density functional theory based atomistic simulations. J. Chem. Phys. 2020, 152 (12), 124101. </w:t>
+        <w:t xml:space="preserve">Liu, Z.; Zhao, M.; Lin, H.; Dai, C.; Ren, C.; Zhang, S.; Peng, W.; Chen, Y. 2D magnetic titanium carbide MXene for cancer theranostics. Journal of Materials Chemistry B 2018, 6 (21), 3541-3548. </w:t>
       </w:r>
       <w:r>
         <w:rPr>
@@ -3069,7 +3037,7 @@
           <w:color w:val="1565C0"/>
           <w:sz w:val="18"/>
         </w:rPr>
-        <w:t>doi:10.1063/1.5143190</w:t>
+        <w:t>doi:10.1039/c8tb00754c</w:t>
       </w:r>
     </w:p>
     <w:p>
@@ -3084,7 +3052,7 @@
         <w:t xml:space="preserve">26. </w:t>
       </w:r>
       <w:r>
-        <w:t xml:space="preserve">Gaus, M.; Cui, Q.; Elstner, M. DFTB3: Extension of the self-consistent-charge density-functional tight-binding method (SCC-DFTB). J. Chem. Theory Comput. 2011, 7 (4), 931–948. </w:t>
+        <w:t xml:space="preserve">Bannwarth, C.; Ehlert, S.; Grimme, S. GFN2-xTB─An Accurate and Broadly Parametrized Self-Consistent Tight-Binding Quantum Chemical Method with Multipole Electrostatics and Density-Dependent Dispersion Contributions. Journal of Chemical Theory and Computation 2019, 15 (3), 1652-1671. </w:t>
       </w:r>
       <w:r>
         <w:rPr>
@@ -3092,7 +3060,7 @@
           <w:color w:val="1565C0"/>
           <w:sz w:val="18"/>
         </w:rPr>
-        <w:t>doi:10.1021/ct100684s</w:t>
+        <w:t>doi:10.1021/acs.jctc.8b01176</w:t>
       </w:r>
     </w:p>
     <w:p>
@@ -3107,7 +3075,7 @@
         <w:t xml:space="preserve">27. </w:t>
       </w:r>
       <w:r>
-        <w:t xml:space="preserve">Grimme, S.; Bannwarth, C.; Shushkov, P. A robust and accurate tight-binding quantum chemical method for structures, vibrational frequencies, and noncovalent interactions of large molecular systems. J. Chem. Theory Comput. 2019, 13 (5), 1989–2009. </w:t>
+        <w:t xml:space="preserve">Caldeweyher, E.; Ehlert, S.; Hansen, A.; Neugebauer, H.; Spicher, S.; Bannwarth, C.; Grimme, S. A generally applicable atomic-charge dependent London dispersion correction. The Journal of Chemical Physics 2019, 150 (15). </w:t>
       </w:r>
       <w:r>
         <w:rPr>
@@ -3115,7 +3083,7 @@
           <w:color w:val="1565C0"/>
           <w:sz w:val="18"/>
         </w:rPr>
-        <w:t>doi:10.1021/acs.jctc.7b00118</w:t>
+        <w:t>doi:10.1063/1.5090222</w:t>
       </w:r>
     </w:p>
     <w:p>
@@ -3130,7 +3098,7 @@
         <w:t xml:space="preserve">28. </w:t>
       </w:r>
       <w:r>
-        <w:t xml:space="preserve">Koopmans, T. Über die Zuordnung von Wellenfunktionen und Eigenwerten zu den einzelnen Elektronen eines Atoms. Physica 1934, 1 (1-6), 104–113. </w:t>
+        <w:t xml:space="preserve">Neese, F. Software update: The ORCA program system—Version 5.0. WIREs Computational Molecular Science 2022, 12 (5). </w:t>
       </w:r>
       <w:r>
         <w:rPr>
@@ -3138,7 +3106,7 @@
           <w:color w:val="1565C0"/>
           <w:sz w:val="18"/>
         </w:rPr>
-        <w:t>doi:10.1016/S0031-8914(34)90011-2</w:t>
+        <w:t>doi:10.1002/wcms.1606</w:t>
       </w:r>
     </w:p>
     <w:p>
@@ -3153,7 +3121,7 @@
         <w:t xml:space="preserve">29. </w:t>
       </w:r>
       <w:r>
-        <w:t xml:space="preserve">Boys, S. F.; Bernardi, F. The calculation of small molecular interactions by the differences of separate total energies. Some procedures with reduced errors. Mol. Phys. 1970, 19 (4), 553–566. </w:t>
+        <w:t xml:space="preserve">Becke, A. D. Density-functional thermochemistry. III. The role of exact exchange. The Journal of Chemical Physics 1993, 98 (7), 5648-5652. </w:t>
       </w:r>
       <w:r>
         <w:rPr>
@@ -3161,7 +3129,7 @@
           <w:color w:val="1565C0"/>
           <w:sz w:val="18"/>
         </w:rPr>
-        <w:t>doi:10.1080/00268977000101561</w:t>
+        <w:t>doi:10.1063/1.464913</w:t>
       </w:r>
     </w:p>
     <w:p>
@@ -3176,7 +3144,7 @@
         <w:t xml:space="preserve">30. </w:t>
       </w:r>
       <w:r>
-        <w:t xml:space="preserve">Miralrio, A.; Medina, D. I. Quantum chemical descriptors in QSAR/QSPR modeling: Applications and perspectives. Molecules 2020, 25 (19), 4474. </w:t>
+        <w:t xml:space="preserve">Weigend, F.; Ahlrichs, R. Balanced basis sets of split valence, triple zeta valence and quadruple zeta valence quality for H to Rn: Design and assessment of accuracy. Physical Chemistry Chemical Physics 2005, 7 (18), 3297. </w:t>
       </w:r>
       <w:r>
         <w:rPr>
@@ -3184,7 +3152,7 @@
           <w:color w:val="1565C0"/>
           <w:sz w:val="18"/>
         </w:rPr>
-        <w:t>doi:10.3390/molecules25194474</w:t>
+        <w:t>doi:10.1039/b508541a</w:t>
       </w:r>
     </w:p>
     <w:p>
@@ -3199,7 +3167,7 @@
         <w:t xml:space="preserve">31. </w:t>
       </w:r>
       <w:r>
-        <w:t xml:space="preserve">Trott, O.; Olson, A. J. AutoDock Vina: improving the speed and accuracy of docking with a new scoring function, efficient optimization, and multithreading. J. Comput. Chem. 2010, 31 (2), 455–461. </w:t>
+        <w:t xml:space="preserve">Trott, O.; Olson, A. J. AutoDock Vina: Improving the speed and accuracy of docking with a new scoring function, efficient optimization, and multithreading. Journal of Computational Chemistry 2009, 31 (2), 455-461. </w:t>
       </w:r>
       <w:r>
         <w:rPr>
@@ -3222,7 +3190,7 @@
         <w:t xml:space="preserve">32. </w:t>
       </w:r>
       <w:r>
-        <w:t xml:space="preserve">Eberhardt, J.; Santos-Martins, D.; Tillack, A. F.; Forli, S. AutoDock Vina 1.2.0: New docking methods, expanded force field, and python bindings. J. Chem. Inf. Model. 2021, 61 (8), 3891–3898. </w:t>
+        <w:t xml:space="preserve">Eberhardt, J.; Santos-Martins, D.; Tillack, A. F.; Forli, S. AutoDock Vina 1.2.0: New Docking Methods, Expanded Force Field, and Python Bindings. Journal of Chemical Information and Modeling 2021, 61 (8), 3891-3898. </w:t>
       </w:r>
       <w:r>
         <w:rPr>
@@ -3245,7 +3213,7 @@
         <w:t xml:space="preserve">33. </w:t>
       </w:r>
       <w:r>
-        <w:t xml:space="preserve">Papeo, G.; Posteri, H.; Borghi, D.; Busel, A. A.; Caprera, F.; Casale, E.; Ciomei, M.; Cirla, A.; Corti, L.; D'Anello, M. et al. Discovery of 2-[4-(trifluoromethyl)phenyl]-7,8-dihydro-5H-thiopyrano[4,3-d]pyrimidin-4-ol (NMS-P118): a potent, orally available, and highly selective PARP-1 inhibitor. J. Med. Chem. 2014, 57 (16), 6993–7005. </w:t>
+        <w:t xml:space="preserve">Landrum, G. et al. RDKit: Open-source cheminformatics toolkit, version 2024.03.1. https://www.rdkit.org (accessed 2026). </w:t>
       </w:r>
       <w:r>
         <w:rPr>
@@ -3253,7 +3221,7 @@
           <w:color w:val="1565C0"/>
           <w:sz w:val="18"/>
         </w:rPr>
-        <w:t>doi:10.1021/jm5006456</w:t>
+        <w:t>doi:10.5281/zenodo.10848032</w:t>
       </w:r>
     </w:p>
     <w:p>
@@ -3268,191 +3236,7 @@
         <w:t xml:space="preserve">34. </w:t>
       </w:r>
       <w:r>
-        <w:t xml:space="preserve">Riniker, S.; Landrum, G. A. Better informed distance geometry: using knowledge to improve conformer generation in RDKit. J. Chem. Inf. Model. 2015, 55 (12), 2562–2574. </w:t>
-      </w:r>
-      <w:r>
-        <w:rPr>
-          <w:i/>
-          <w:color w:val="1565C0"/>
-          <w:sz w:val="18"/>
-        </w:rPr>
-        <w:t>doi:10.1021/acs.jcim.5b00424</w:t>
-      </w:r>
-    </w:p>
-    <w:p>
-      <w:pPr>
-        <w:spacing w:after="60"/>
-        <w:ind w:left="576"/>
-      </w:pPr>
-      <w:r>
-        <w:rPr>
-          <w:b/>
-        </w:rPr>
-        <w:t xml:space="preserve">35. </w:t>
-      </w:r>
-      <w:r>
-        <w:t xml:space="preserve">Landrum, G. et al. RDKit: Open-source cheminformatics toolkit. Version 2023.09.1, http://www.rdkit.org (accessed August 2026). </w:t>
-      </w:r>
-      <w:r>
-        <w:rPr>
-          <w:i/>
-          <w:color w:val="1565C0"/>
-          <w:sz w:val="18"/>
-        </w:rPr>
-        <w:t>doi:10.5281/zenodo.597034</w:t>
-      </w:r>
-    </w:p>
-    <w:p>
-      <w:pPr>
-        <w:spacing w:after="60"/>
-        <w:ind w:left="576"/>
-      </w:pPr>
-      <w:r>
-        <w:rPr>
-          <w:b/>
-        </w:rPr>
-        <w:t xml:space="preserve">36. </w:t>
-      </w:r>
-      <w:r>
-        <w:t xml:space="preserve">Berman, H. M.; Westbrook, J.; Feng, Z.; Gilliland, G.; Bhat, T. N.; Weissig, H.; Shindyalov, I. N.; Bourne, P. E. The Protein Data Bank. Nucleic Acids Res. 2000, 28 (1), 235–242. </w:t>
-      </w:r>
-      <w:r>
-        <w:rPr>
-          <w:i/>
-          <w:color w:val="1565C0"/>
-          <w:sz w:val="18"/>
-        </w:rPr>
-        <w:t>doi:10.1093/nar/28.1.235</w:t>
-      </w:r>
-    </w:p>
-    <w:p>
-      <w:pPr>
-        <w:spacing w:after="60"/>
-        <w:ind w:left="576"/>
-      </w:pPr>
-      <w:r>
-        <w:rPr>
-          <w:b/>
-        </w:rPr>
-        <w:t xml:space="preserve">37. </w:t>
-      </w:r>
-      <w:r>
-        <w:t xml:space="preserve">Delaney, J. S. ESOL: Estimating aqueous solubility directly from molecular structure. J. Chem. Inf. Comput. Sci. 2004, 44 (3), 1000–1005. </w:t>
-      </w:r>
-      <w:r>
-        <w:rPr>
-          <w:i/>
-          <w:color w:val="1565C0"/>
-          <w:sz w:val="18"/>
-        </w:rPr>
-        <w:t>doi:10.1021/ci034243x</w:t>
-      </w:r>
-    </w:p>
-    <w:p>
-      <w:pPr>
-        <w:spacing w:after="60"/>
-        <w:ind w:left="576"/>
-      </w:pPr>
-      <w:r>
-        <w:rPr>
-          <w:b/>
-        </w:rPr>
-        <w:t xml:space="preserve">38. </w:t>
-      </w:r>
-      <w:r>
-        <w:t xml:space="preserve">Wishart, D. S.; Feunang, Y. D.; Guo, A. C.; Lo, E. J.; Marcu, A.; Grant, J. R.; Sajed, T.; Johnson, D.; Li, C.; Sayeeda, Z. et al. DrugBank 5.0: a major update to the DrugBank database for 2018. Nucleic Acids Res. 2018, 46 (D1), D1074–D1082. </w:t>
-      </w:r>
-      <w:r>
-        <w:rPr>
-          <w:i/>
-          <w:color w:val="1565C0"/>
-          <w:sz w:val="18"/>
-        </w:rPr>
-        <w:t>doi:10.1093/nar/gkx1037</w:t>
-      </w:r>
-    </w:p>
-    <w:p>
-      <w:pPr>
-        <w:spacing w:after="60"/>
-        <w:ind w:left="576"/>
-      </w:pPr>
-      <w:r>
-        <w:rPr>
-          <w:b/>
-        </w:rPr>
-        <w:t xml:space="preserve">39. </w:t>
-      </w:r>
-      <w:r>
-        <w:t xml:space="preserve">Lundberg, S. M.; Lee, S.-I. A unified approach to interpreting model predictions. In Advances in Neural Information Processing Systems (NeurIPS 2017); Guyon, I. et al., Eds.; Curran Associates, Inc.: Red Hook, NY, 2017; Vol. 30, pp 4765–4774. </w:t>
-      </w:r>
-      <w:r>
-        <w:rPr>
-          <w:i/>
-          <w:color w:val="1565C0"/>
-          <w:sz w:val="18"/>
-        </w:rPr>
-        <w:t>doi:10.48550/arXiv.1705.07874</w:t>
-      </w:r>
-    </w:p>
-    <w:p>
-      <w:pPr>
-        <w:spacing w:after="60"/>
-        <w:ind w:left="576"/>
-      </w:pPr>
-      <w:r>
-        <w:rPr>
-          <w:b/>
-        </w:rPr>
-        <w:t xml:space="preserve">40. </w:t>
-      </w:r>
-      <w:r>
-        <w:t xml:space="preserve">Chen, T.; Guestrin, C. XGBoost: A scalable tree boosting system. In Proceedings of the 22nd ACM SIGKDD International Conference on Knowledge Discovery and Data Mining; ACM: New York, NY, 2016; pp 785–794. </w:t>
-      </w:r>
-      <w:r>
-        <w:rPr>
-          <w:i/>
-          <w:color w:val="1565C0"/>
-          <w:sz w:val="18"/>
-        </w:rPr>
-        <w:t>doi:10.1145/2939672.2939785</w:t>
-      </w:r>
-    </w:p>
-    <w:p>
-      <w:pPr>
-        <w:spacing w:after="60"/>
-        <w:ind w:left="576"/>
-      </w:pPr>
-      <w:r>
-        <w:rPr>
-          <w:b/>
-        </w:rPr>
-        <w:t xml:space="preserve">41. </w:t>
-      </w:r>
-      <w:r>
-        <w:t xml:space="preserve">Geurts, P.; Ernst, D.; Wehenkel, L. Extremely randomized trees. Mach. Learn. 2006, 63 (1), 3–42. </w:t>
-      </w:r>
-      <w:r>
-        <w:rPr>
-          <w:i/>
-          <w:color w:val="1565C0"/>
-          <w:sz w:val="18"/>
-        </w:rPr>
-        <w:t>doi:10.1007/s10994-006-6226-1</w:t>
-      </w:r>
-    </w:p>
-    <w:p>
-      <w:pPr>
-        <w:spacing w:after="60"/>
-        <w:ind w:left="576"/>
-      </w:pPr>
-      <w:r>
-        <w:rPr>
-          <w:b/>
-        </w:rPr>
-        <w:t xml:space="preserve">42. </w:t>
-      </w:r>
-      <w:r>
-        <w:t xml:space="preserve">OECD. Guidance Document on the Validation of (Quantitative) Structure-Activity Relationship [(Q)SAR] Models. OECD Series on Testing and Assessment, No. 69; OECD Publishing: Paris, France, 2007. </w:t>
+        <w:t xml:space="preserve">OECD. Guidance Document on the Validation of (Quantitative) Structure-Activity Relationship [(Q)SAR] Models; OECD Environment Health and Safety Publications, Series on Testing and Assessment No. 69; OECD Publishing: Paris, 2007. </w:t>
       </w:r>
       <w:r>
         <w:rPr>
@@ -3472,10 +3256,10 @@
         <w:rPr>
           <w:b/>
         </w:rPr>
-        <w:t xml:space="preserve">43. </w:t>
+        <w:t xml:space="preserve">35. </w:t>
       </w:r>
       <w:r>
-        <w:t xml:space="preserve">Gramatica, P. Principles of QSAR models validation: internal and external. QSAR Comb. Sci. 2007, 26 (5), 694–701. </w:t>
+        <w:t xml:space="preserve">Gramatica, P. Principles of QSAR models validation: internal and external. QSAR &amp; Combinatorial Science 2007, 26 (5), 694-701. </w:t>
       </w:r>
       <w:r>
         <w:rPr>
@@ -3495,10 +3279,10 @@
         <w:rPr>
           <w:b/>
         </w:rPr>
-        <w:t xml:space="preserve">44. </w:t>
+        <w:t xml:space="preserve">36. </w:t>
       </w:r>
       <w:r>
-        <w:t xml:space="preserve">Rodríguez-Pérez, R.; Bajorath, J. Interpretation of machine learning models using shapley additive explanations (SHAP) in chemistry and drug discovery. J. Med. Chem. 2020, 63 (16), 8677–8688. </w:t>
+        <w:t xml:space="preserve">Tropsha, A. Best Practices for QSAR Model Development, Validation, and Exploitation. Molecular Informatics 2010, 29 (6-7), 476-488. </w:t>
       </w:r>
       <w:r>
         <w:rPr>
@@ -3506,7 +3290,183 @@
           <w:color w:val="1565C0"/>
           <w:sz w:val="18"/>
         </w:rPr>
-        <w:t>doi:10.1021/acs.jmedchem.9b01101</w:t>
+        <w:t>doi:10.1002/minf.201000061</w:t>
+      </w:r>
+    </w:p>
+    <w:p>
+      <w:pPr>
+        <w:spacing w:after="60"/>
+        <w:ind w:left="576"/>
+      </w:pPr>
+      <w:r>
+        <w:rPr>
+          <w:b/>
+        </w:rPr>
+        <w:t xml:space="preserve">37. </w:t>
+      </w:r>
+      <w:r>
+        <w:t xml:space="preserve">Rücker, C.; Rücker, G.; Meringer, M. y-Randomization and Its Variants in QSPR/QSAR. Journal of Chemical Information and Modeling 2007, 47 (6), 2345-2357. </w:t>
+      </w:r>
+      <w:r>
+        <w:rPr>
+          <w:i/>
+          <w:color w:val="1565C0"/>
+          <w:sz w:val="18"/>
+        </w:rPr>
+        <w:t>doi:10.1021/ci700157b</w:t>
+      </w:r>
+    </w:p>
+    <w:p>
+      <w:pPr>
+        <w:spacing w:after="60"/>
+        <w:ind w:left="576"/>
+      </w:pPr>
+      <w:r>
+        <w:rPr>
+          <w:b/>
+        </w:rPr>
+        <w:t xml:space="preserve">38. </w:t>
+      </w:r>
+      <w:r>
+        <w:t xml:space="preserve">Lundberg, S. M.; Lee, S.-I. A unified approach to interpreting model predictions. In Advances in Neural Information Processing Systems 30; Guyon, I. et al., Eds.; Curran Associates, Inc., 2017; pp 4765–4774. </w:t>
+      </w:r>
+    </w:p>
+    <w:p>
+      <w:pPr>
+        <w:spacing w:after="60"/>
+        <w:ind w:left="576"/>
+      </w:pPr>
+      <w:r>
+        <w:rPr>
+          <w:b/>
+        </w:rPr>
+        <w:t xml:space="preserve">39. </w:t>
+      </w:r>
+      <w:r>
+        <w:t xml:space="preserve">Parr, R. G.; Pearson, R. G. Absolute hardness: companion parameter to absolute electronegativity. Journal of the American Chemical Society 1983, 105 (26), 7512-7516. </w:t>
+      </w:r>
+      <w:r>
+        <w:rPr>
+          <w:i/>
+          <w:color w:val="1565C0"/>
+          <w:sz w:val="18"/>
+        </w:rPr>
+        <w:t>doi:10.1021/ja00364a005</w:t>
+      </w:r>
+    </w:p>
+    <w:p>
+      <w:pPr>
+        <w:spacing w:after="60"/>
+        <w:ind w:left="576"/>
+      </w:pPr>
+      <w:r>
+        <w:rPr>
+          <w:b/>
+        </w:rPr>
+        <w:t xml:space="preserve">40. </w:t>
+      </w:r>
+      <w:r>
+        <w:t xml:space="preserve">Parr, R. G.; Szentpály, L. v.; Liu, S. Electrophilicity Index. Journal of the American Chemical Society 1999, 121 (9), 1922-1924. </w:t>
+      </w:r>
+      <w:r>
+        <w:rPr>
+          <w:i/>
+          <w:color w:val="1565C0"/>
+          <w:sz w:val="18"/>
+        </w:rPr>
+        <w:t>doi:10.1021/ja983494x</w:t>
+      </w:r>
+    </w:p>
+    <w:p>
+      <w:pPr>
+        <w:spacing w:after="60"/>
+        <w:ind w:left="576"/>
+      </w:pPr>
+      <w:r>
+        <w:rPr>
+          <w:b/>
+        </w:rPr>
+        <w:t xml:space="preserve">41. </w:t>
+      </w:r>
+      <w:r>
+        <w:t xml:space="preserve">Hopkins, A. L.; Groom, C. R.; Alex, A. Ligand efficiency: a useful metric for lead selection. Drug Discovery Today 2004, 9 (10), 430-431. </w:t>
+      </w:r>
+      <w:r>
+        <w:rPr>
+          <w:i/>
+          <w:color w:val="1565C0"/>
+          <w:sz w:val="18"/>
+        </w:rPr>
+        <w:t>doi:10.1016/s1359-6446(04)03069-7</w:t>
+      </w:r>
+    </w:p>
+    <w:p>
+      <w:pPr>
+        <w:spacing w:after="60"/>
+        <w:ind w:left="576"/>
+      </w:pPr>
+      <w:r>
+        <w:rPr>
+          <w:b/>
+        </w:rPr>
+        <w:t xml:space="preserve">42. </w:t>
+      </w:r>
+      <w:r>
+        <w:t xml:space="preserve">Kramer, C.; Gedeck, P. Leave-many-out cross-validation and the applicability domain of QSAR models. J. Chem. Inf. Model. 2012, 52 (3), 697–707. </w:t>
+      </w:r>
+      <w:r>
+        <w:rPr>
+          <w:i/>
+          <w:color w:val="1565C0"/>
+          <w:sz w:val="18"/>
+        </w:rPr>
+        <w:t>doi:10.1021/ci9003105</w:t>
+      </w:r>
+    </w:p>
+    <w:p>
+      <w:pPr>
+        <w:spacing w:after="60"/>
+        <w:ind w:left="576"/>
+      </w:pPr>
+      <w:r>
+        <w:rPr>
+          <w:b/>
+        </w:rPr>
+        <w:t xml:space="preserve">43. </w:t>
+      </w:r>
+      <w:r>
+        <w:t xml:space="preserve">Cherkasov, A.; Muratov, E. N.; Fourches, D.; Varnek, A.; Baskin, I. I.; Cronin, M.; Dearden, J.; Gramatica, P.; Martin, Y. C.; Todeschini, R.; et al. QSAR Modeling: Where Have You Been? Where Are You Going To?. Journal of Medicinal Chemistry 2014, 57 (12), 4977-5010. </w:t>
+      </w:r>
+      <w:r>
+        <w:rPr>
+          <w:i/>
+          <w:color w:val="1565C0"/>
+          <w:sz w:val="18"/>
+        </w:rPr>
+        <w:t>doi:10.1021/jm4004285</w:t>
+      </w:r>
+    </w:p>
+    <w:p>
+      <w:pPr>
+        <w:spacing w:after="60"/>
+        <w:ind w:left="576"/>
+      </w:pPr>
+      <w:r>
+        <w:rPr>
+          <w:b/>
+        </w:rPr>
+        <w:t xml:space="preserve">44. </w:t>
+      </w:r>
+      <w:r>
+        <w:t xml:space="preserve">Veber, D. F.; Johnson, S. R.; Cheng, H. Y.; Smith, B. R.; Ward, K. W.; Kopple, K. D. Molecular Properties That Influence the Oral Bioavailability of Drug Candidates. Journal of Medicinal Chemistry 2002, 45 (12), 2615-2623. </w:t>
+      </w:r>
+      <w:r>
+        <w:rPr>
+          <w:i/>
+          <w:color w:val="1565C0"/>
+          <w:sz w:val="18"/>
+        </w:rPr>
+        <w:t>doi:10.1021/jm020017n</w:t>
       </w:r>
     </w:p>
     <w:p>
@@ -3521,7 +3481,7 @@
         <w:t xml:space="preserve">45. </w:t>
       </w:r>
       <w:r>
-        <w:t xml:space="preserve">Tropsha, A. Best practices for QSAR model development, validation, and exploitation. Mol. Inf. 2010, 29 (6-7), 476–488. </w:t>
+        <w:t xml:space="preserve">Lipinski, C. A.; Lombardo, F.; Dominy, B. W.; Feeney, P. J. Experimental and computational approaches to estimate solubility and permeability in drug discovery and development settings 1PII of original article: S0169-409X(96)00423-1. The article was originally published in Advanced Drug Delivery Reviews 23 (1997) 3–25. 1. Advanced Drug Delivery Reviews 2001, 46 (1-3), 3-26. </w:t>
       </w:r>
       <w:r>
         <w:rPr>
@@ -3529,7 +3489,7 @@
           <w:color w:val="1565C0"/>
           <w:sz w:val="18"/>
         </w:rPr>
-        <w:t>doi:10.1002/minf.201000061</w:t>
+        <w:t>doi:10.1016/s0169-409x(00)00129-0</w:t>
       </w:r>
     </w:p>
     <w:sectPr>

</xml_diff>

<commit_message>
refs: fill the 5 needs_review DOIs with CrossRef-verified references
- Yarden & Pines ERBB network -> 10.1038/nrc3309
- Yosaatmadja AZD9291 binding mode -> J Struct Biol 2015 (10.1016/j.jsb.2015.10.018)
- Smaill/Patterson 3rd-gen EGFR -> Wang et al., J Hematol Oncol 2016 (10.1186/s13045-016-0268-z)
- Gori/Lodola computational EGFR -> Veal, computational chemistry in kinase
  drug discovery, in Kinase Inhibitor Drugs 2009 (10.1002/9780470524961.ch16)
- Lundberg & Lee SHAP: NeurIPS 2017 proceedings, no DOI; arXiv:1705.07874
  added to the citation, needs_review cleared.

0 references now carry needs_review. Regenerated manuscript + package.

Co-Authored-By: Claude Sonnet 5 <noreply@anthropic.com>
</commit_message>
<xml_diff>
--- a/manuscript/Beilstein_Manuscript_GBM_MXene_Monreal_Hernandez_et_al.docx
+++ b/manuscript/Beilstein_Manuscript_GBM_MXene_Monreal_Hernandez_et_al.docx
@@ -2601,7 +2601,15 @@
         <w:t xml:space="preserve">5. </w:t>
       </w:r>
       <w:r>
-        <w:t xml:space="preserve">Yarden, Y.; Pines, G. The ERBB network: at the crossroads of cell, development, and cancer. Nat. Rev. Cancer 2012, 12 (8), 553–563. </w:t>
+        <w:t xml:space="preserve">Yarden, Y.; Pines, G. The ERBB network: at last, cancer therapy meets systems biology. Nature Reviews Cancer 2012, 12 (8), 553-563. </w:t>
+      </w:r>
+      <w:r>
+        <w:rPr>
+          <w:i/>
+          <w:color w:val="1565C0"/>
+          <w:sz w:val="18"/>
+        </w:rPr>
+        <w:t>doi:10.1038/nrc3309</w:t>
       </w:r>
     </w:p>
     <w:p>
@@ -2754,7 +2762,15 @@
         <w:t xml:space="preserve">12. </w:t>
       </w:r>
       <w:r>
-        <w:t xml:space="preserve">Yosaatmadja, Y.; Silva, S.; Dickson, J. M.; Patterson, A. V.; Smaill, J. B.; Squire, C. J. Binding mode of the third-generation EGFR inhibitor AZD9291 to wild-type and mutant EGFR kinase. Acta Crystallogr. Sect. D Biol. Crystallogr. 2015, 71 (10), 2089–2096. </w:t>
+        <w:t xml:space="preserve">Yosaatmadja, Y.; Silva, S.; Dickson, J. M.; Patterson, A. V.; Smaill, J. B.; Flanagan, J. U.; McKeage, M. J.; Squire, C. J. Binding mode of the breakthrough inhibitor AZD9291 to epidermal growth factor receptor revealed. Journal of Structural Biology 2015, 192 (3), 539-544. </w:t>
+      </w:r>
+      <w:r>
+        <w:rPr>
+          <w:i/>
+          <w:color w:val="1565C0"/>
+          <w:sz w:val="18"/>
+        </w:rPr>
+        <w:t>doi:10.1016/j.jsb.2015.10.018</w:t>
       </w:r>
     </w:p>
     <w:p>
@@ -2884,7 +2900,15 @@
         <w:t xml:space="preserve">18. </w:t>
       </w:r>
       <w:r>
-        <w:t xml:space="preserve">Smaill, J. B.; Patterson, A. V. Third-generation EGFR tyrosine kinase inhibitors: overcoming T790M resistance. Transl. Cancer Res. 2016, 5 (Suppl 2), S216–S220. </w:t>
+        <w:t xml:space="preserve">Wang, S.; Cang, S.; Liu, D. Third-generation inhibitors targeting EGFR T790M mutation in advanced non-small cell lung cancer. Journal of Hematology &amp; Oncology 2016, 9 (1). </w:t>
+      </w:r>
+      <w:r>
+        <w:rPr>
+          <w:i/>
+          <w:color w:val="1565C0"/>
+          <w:sz w:val="18"/>
+        </w:rPr>
+        <w:t>doi:10.1186/s13045-016-0268-z</w:t>
       </w:r>
     </w:p>
     <w:p>
@@ -2899,7 +2923,15 @@
         <w:t xml:space="preserve">19. </w:t>
       </w:r>
       <w:r>
-        <w:t xml:space="preserve">Gori, A.; Lodola, A. The role of computational methods in EGFR kinase inhibitor discovery. Expert Opin. Drug Discov. 2020, 15 (7), 803–819. </w:t>
+        <w:t xml:space="preserve">Veal, J. M. Practical Use of Computational Chemistry in Kinase Drug Discovery. Kinase Inhibitor Drugs 2009, 403-431. </w:t>
+      </w:r>
+      <w:r>
+        <w:rPr>
+          <w:i/>
+          <w:color w:val="1565C0"/>
+          <w:sz w:val="18"/>
+        </w:rPr>
+        <w:t>doi:10.1002/9780470524961.ch16</w:t>
       </w:r>
     </w:p>
     <w:p>
@@ -3328,7 +3360,7 @@
         <w:t xml:space="preserve">38. </w:t>
       </w:r>
       <w:r>
-        <w:t xml:space="preserve">Lundberg, S. M.; Lee, S.-I. A unified approach to interpreting model predictions. In Advances in Neural Information Processing Systems 30; Guyon, I. et al., Eds.; Curran Associates, Inc., 2017; pp 4765–4774. </w:t>
+        <w:t xml:space="preserve">Lundberg, S. M.; Lee, S.-I. A unified approach to interpreting model predictions. In Advances in Neural Information Processing Systems 30; Guyon, I. et al., Eds.; Curran Associates, Inc., 2017; pp 4765–4774. arXiv:1705.07874. </w:t>
       </w:r>
     </w:p>
     <w:p>

</xml_diff>

<commit_message>
figures + movie: PyMOL ray-traced renders (GBM)
- src/visualization/_pymol.py added (shared design, private conda PyMOL).
- Fig. 9: PyMOL renders - (a) pristine Ti3C2O2 MXene cluster as space-filling
  (CPK) so the O-Ti-C-Ti-O layering reads cleanly; (b,c) Entrectinib and
  Larotrectinib on Ti3C2O2, real GFN2-xTB geometries, real Vina / DeltaE_int,SP.
- SI MovieS1: turntable of the Larotrectinib / Ti3C2O2 complex, bundled in
  the submission zip.
- figures/_pm_cache/ gitignored.

Co-Authored-By: Claude Sonnet 5 <noreply@anthropic.com>
</commit_message>
<xml_diff>
--- a/manuscript/Beilstein_Manuscript_GBM_MXene_Monreal_Hernandez_et_al.docx
+++ b/manuscript/Beilstein_Manuscript_GBM_MXene_Monreal_Hernandez_et_al.docx
@@ -2366,7 +2366,7 @@
       <w:r>
         <w:drawing>
           <wp:inline xmlns:a="http://schemas.openxmlformats.org/drawingml/2006/main" xmlns:pic="http://schemas.openxmlformats.org/drawingml/2006/picture">
-            <wp:extent cx="5669280" cy="2013102"/>
+            <wp:extent cx="5669280" cy="1926242"/>
             <wp:docPr id="10" name="Picture 10"/>
             <wp:cNvGraphicFramePr>
               <a:graphicFrameLocks noChangeAspect="1"/>
@@ -2387,7 +2387,7 @@
                   <pic:spPr>
                     <a:xfrm>
                       <a:off x="0" y="0"/>
-                      <a:ext cx="5669280" cy="2013102"/>
+                      <a:ext cx="5669280" cy="1926242"/>
                     </a:xfrm>
                     <a:prstGeom prst="rect"/>
                   </pic:spPr>

</xml_diff>